<commit_message>
Regenerate the Word guide so it cannot disagree with the Markdown
Rebuilt from GAZEBO_QUICKSTART.md with docs/make_gazebo_docx.py, so the copy
teammates open matches the copy that was verified. Generated to the scratchpad
and copied in, because Word locks the file while it is open and the write then
fails; DOCX_OUT exists for exactly that.

Verified by reading the result back: --recurse-submodules, bootstrap.sh,
IMAGE_TAR, the Windows 10 build 19044 threshold, docker save and the IN LANE
coin flip are all present, and there are no em dashes.

Co-Authored-By: Claude Opus 5 (1M context) <noreply@anthropic.com>
</commit_message>
<xml_diff>
--- a/docs/IGVC_2027_Gazebo_Setup_Guide.docx
+++ b/docs/IGVC_2027_Gazebo_Setup_Guide.docx
@@ -16,10 +16,21 @@
         <w:rPr>
           <w:b/>
         </w:rPr>
-        <w:t>For a team member who has the repo and has never run the simulator.</w:t>
-      </w:r>
-      <w:r>
-        <w:t xml:space="preserve"> Follow it top to bottom and you will end with a robot navigating the IGVC course on your own machine. Roughly 45 minutes, most of which is one image build you can walk away from.</w:t>
+        <w:t>For a team member who has never opened this repository.</w:t>
+      </w:r>
+      <w:r>
+        <w:t xml:space="preserve"> Follow it top to bottom and you will end with a robot navigating the IGVC course on your own machine.</w:t>
+      </w:r>
+    </w:p>
+    <w:p>
+      <w:r>
+        <w:rPr>
+          <w:b/>
+        </w:rPr>
+        <w:t>Verified 2026-09-17</w:t>
+      </w:r>
+      <w:r>
+        <w:t xml:space="preserve"> on Windows 11 Home (build 26200), RTX 5070 Ti Laptop 12 GB, driver 610.88, Docker Desktop 29.7.2 with the WSL2 backend, WSL2 Ubuntu-26.04. Every number in this file was measured on that machine. It is an x86 laptop, not the robot's Jetson, so do not quote the timings as robot performance.</w:t>
       </w:r>
     </w:p>
     <w:p>
@@ -31,7 +42,7 @@
         <w:t>GAZEBO_SETUP.md</w:t>
       </w:r>
       <w:r>
-        <w:t xml:space="preserve"> is the reference and explains *why* for everything here. This file is the *how*, and it does not assume you have read that one.</w:t>
+        <w:t xml:space="preserve"> is the reference and explains *why* for everything here. This file is the *how* and does not assume you have read that one.</w:t>
       </w:r>
     </w:p>
     <w:p>
@@ -39,12 +50,107 @@
         <w:rPr>
           <w:b/>
         </w:rPr>
-        <w:t>Verified 2026-09-15</w:t>
-      </w:r>
-      <w:r>
-        <w:t xml:space="preserve"> on Windows 11, RTX 5070 Ti Laptop, Docker Desktop 29.7.2, WSL2 Ubuntu-26.04.</w:t>
+        <w:t>How long it takes:</w:t>
       </w:r>
     </w:p>
+    <w:tbl>
+      <w:tblPr>
+        <w:tblStyle w:val="LightGrid-Accent1"/>
+        <w:tblW w:type="auto" w:w="0"/>
+        <w:tblLook w:firstColumn="1" w:firstRow="1" w:lastColumn="0" w:lastRow="0" w:noHBand="0" w:noVBand="1" w:val="04A0"/>
+      </w:tblPr>
+      <w:tblGrid>
+        <w:gridCol w:w="4320"/>
+        <w:gridCol w:w="4320"/>
+      </w:tblGrid>
+      <w:tr>
+        <w:tc>
+          <w:tcPr>
+            <w:tcW w:type="dxa" w:w="4320"/>
+          </w:tcPr>
+          <w:p>
+            <w:r>
+              <w:rPr>
+                <w:b/>
+              </w:rPr>
+            </w:r>
+            <w:r>
+              <w:rPr>
+                <w:b/>
+              </w:rPr>
+              <w:t>Path</w:t>
+            </w:r>
+          </w:p>
+        </w:tc>
+        <w:tc>
+          <w:tcPr>
+            <w:tcW w:type="dxa" w:w="4320"/>
+          </w:tcPr>
+          <w:p>
+            <w:r>
+              <w:rPr>
+                <w:b/>
+              </w:rPr>
+            </w:r>
+            <w:r>
+              <w:rPr>
+                <w:b/>
+              </w:rPr>
+              <w:t>Time</w:t>
+            </w:r>
+          </w:p>
+        </w:tc>
+      </w:tr>
+      <w:tr>
+        <w:tc>
+          <w:tcPr>
+            <w:tcW w:type="dxa" w:w="4320"/>
+          </w:tcPr>
+          <w:p>
+            <w:r/>
+            <w:r>
+              <w:t>Image handed to you on a USB drive</w:t>
+            </w:r>
+          </w:p>
+        </w:tc>
+        <w:tc>
+          <w:tcPr>
+            <w:tcW w:type="dxa" w:w="4320"/>
+          </w:tcPr>
+          <w:p>
+            <w:r/>
+            <w:r>
+              <w:t>about 10 minutes</w:t>
+            </w:r>
+          </w:p>
+        </w:tc>
+      </w:tr>
+      <w:tr>
+        <w:tc>
+          <w:tcPr>
+            <w:tcW w:type="dxa" w:w="4320"/>
+          </w:tcPr>
+          <w:p>
+            <w:r/>
+            <w:r>
+              <w:t>Image built from source over good wifi</w:t>
+            </w:r>
+          </w:p>
+        </w:tc>
+        <w:tc>
+          <w:tcPr>
+            <w:tcW w:type="dxa" w:w="4320"/>
+          </w:tcPr>
+          <w:p>
+            <w:r/>
+            <w:r>
+              <w:t>about 30 minutes</w:t>
+            </w:r>
+          </w:p>
+        </w:tc>
+      </w:tr>
+    </w:tbl>
+    <w:p/>
     <w:p/>
     <w:p>
       <w:pPr>
@@ -64,7 +170,16 @@
     </w:p>
     <w:p>
       <w:r>
-        <w:t>Docker Desktop's own Linux VM has no display. A container started from PowerShell can never open a window - not Gazebo, not RViz - and the failure is silent: the command appears to work and no window ever arrives. Started from a WSL2 shell, that distro's WSLg sockets mount through and both windows open as ordinary Windows windows on the same GPU.</w:t>
+        <w:t xml:space="preserve">Docker Desktop's own Linux VM has no display. A container started from PowerShell can never open a window, not Gazebo and not RViz, and the failure is </w:t>
+      </w:r>
+      <w:r>
+        <w:rPr>
+          <w:b/>
+        </w:rPr>
+        <w:t>silent</w:t>
+      </w:r>
+      <w:r>
+        <w:t>: the command appears to work and no window ever arrives. Started from a WSL2 shell, that distro's WSLg sockets mount through and both windows open as ordinary Windows windows on the same GPU.</w:t>
       </w:r>
     </w:p>
     <w:p>
@@ -84,7 +199,7 @@
         <w:t>wsl</w:t>
       </w:r>
       <w:r>
-        <w:t xml:space="preserve"> in a terminal, or launching "Ubuntu" from the Start menu. The prompt will end in </w:t>
+        <w:t xml:space="preserve"> in a terminal, or launching "Ubuntu" from the Start menu. The prompt ends in </w:t>
       </w:r>
       <w:r>
         <w:rPr>
@@ -105,6 +220,21 @@
       </w:r>
       <w:r>
         <w:t>.</w:t>
+      </w:r>
+    </w:p>
+    <w:p>
+      <w:r>
+        <w:t xml:space="preserve">The one exception is </w:t>
+      </w:r>
+      <w:r>
+        <w:rPr>
+          <w:rFonts w:ascii="Consolas" w:hAnsi="Consolas"/>
+          <w:sz w:val="19"/>
+        </w:rPr>
+        <w:t>scripts/setup-windows.ps1</w:t>
+      </w:r>
+      <w:r>
+        <w:t xml:space="preserve"> in section 2, which only reads your machine's configuration and is meant for PowerShell.</w:t>
       </w:r>
     </w:p>
     <w:p/>
@@ -191,7 +321,7 @@
           <w:p>
             <w:r/>
             <w:r>
-              <w:t>Windows 11, or Windows 10 build 19044+</w:t>
+              <w:t>Windows 11, or Windows 10 build 19045+</w:t>
             </w:r>
           </w:p>
         </w:tc>
@@ -217,7 +347,7 @@
           <w:p>
             <w:r/>
             <w:r>
-              <w:t>Windows 10 below 19044 has no WSLg, so no windows</w:t>
+              <w:t>See "Windows 10" in 1A</w:t>
             </w:r>
           </w:p>
         </w:tc>
@@ -258,7 +388,7 @@
               <w:t>Ubuntu-26.04</w:t>
             </w:r>
             <w:r>
-              <w:t xml:space="preserve"> with </w:t>
+              <w:t xml:space="preserve">, </w:t>
             </w:r>
             <w:r>
               <w:rPr>
@@ -402,7 +532,7 @@
           <w:p>
             <w:r/>
             <w:r>
-              <w:t>Update the driver</w:t>
+              <w:t>Update the driver. Optional, see 1A</w:t>
             </w:r>
           </w:p>
         </w:tc>
@@ -415,7 +545,7 @@
           <w:p>
             <w:r/>
             <w:r>
-              <w:t>~15 GB free disk</w:t>
+              <w:t>Free disk</w:t>
             </w:r>
           </w:p>
         </w:tc>
@@ -425,6 +555,16 @@
           </w:tcPr>
           <w:p>
             <w:r/>
+            <w:r>
+              <w:rPr>
+                <w:rFonts w:ascii="Consolas" w:hAnsi="Consolas"/>
+                <w:sz w:val="19"/>
+              </w:rPr>
+              <w:t>df -h /mnt/c</w:t>
+            </w:r>
+            <w:r>
+              <w:t xml:space="preserve"> in the WSL2 shell</w:t>
+            </w:r>
           </w:p>
         </w:tc>
         <w:tc>
@@ -433,6 +573,9 @@
           </w:tcPr>
           <w:p>
             <w:r/>
+            <w:r>
+              <w:t>see the table below</w:t>
+            </w:r>
           </w:p>
         </w:tc>
       </w:tr>
@@ -443,63 +586,241 @@
         <w:pStyle w:val="Heading3"/>
       </w:pPr>
       <w:r>
-        <w:t>WSL Integration is the one people miss</w:t>
+        <w:t>Disk, measured rather than guessed</w:t>
       </w:r>
     </w:p>
+    <w:tbl>
+      <w:tblPr>
+        <w:tblStyle w:val="LightGrid-Accent1"/>
+        <w:tblW w:type="auto" w:w="0"/>
+        <w:tblLook w:firstColumn="1" w:firstRow="1" w:lastColumn="0" w:lastRow="0" w:noHBand="0" w:noVBand="1" w:val="04A0"/>
+      </w:tblPr>
+      <w:tblGrid>
+        <w:gridCol w:w="4320"/>
+        <w:gridCol w:w="4320"/>
+      </w:tblGrid>
+      <w:tr>
+        <w:tc>
+          <w:tcPr>
+            <w:tcW w:type="dxa" w:w="4320"/>
+          </w:tcPr>
+          <w:p>
+            <w:r>
+              <w:rPr>
+                <w:b/>
+              </w:rPr>
+            </w:r>
+            <w:r>
+              <w:rPr>
+                <w:b/>
+              </w:rPr>
+              <w:t>Item</w:t>
+            </w:r>
+          </w:p>
+        </w:tc>
+        <w:tc>
+          <w:tcPr>
+            <w:tcW w:type="dxa" w:w="4320"/>
+          </w:tcPr>
+          <w:p>
+            <w:r>
+              <w:rPr>
+                <w:b/>
+              </w:rPr>
+            </w:r>
+            <w:r>
+              <w:rPr>
+                <w:b/>
+              </w:rPr>
+              <w:t>Measured</w:t>
+            </w:r>
+          </w:p>
+        </w:tc>
+      </w:tr>
+      <w:tr>
+        <w:tc>
+          <w:tcPr>
+            <w:tcW w:type="dxa" w:w="4320"/>
+          </w:tcPr>
+          <w:p>
+            <w:r/>
+            <w:r>
+              <w:rPr>
+                <w:rFonts w:ascii="Consolas" w:hAnsi="Consolas"/>
+                <w:sz w:val="19"/>
+              </w:rPr>
+              <w:t>igvc-gazebo-jazzy</w:t>
+            </w:r>
+            <w:r>
+              <w:t xml:space="preserve"> unpacked on disk</w:t>
+            </w:r>
+          </w:p>
+        </w:tc>
+        <w:tc>
+          <w:tcPr>
+            <w:tcW w:type="dxa" w:w="4320"/>
+          </w:tcPr>
+          <w:p>
+            <w:r/>
+            <w:r>
+              <w:rPr>
+                <w:b/>
+              </w:rPr>
+              <w:t>5.57 GB</w:t>
+            </w:r>
+          </w:p>
+        </w:tc>
+      </w:tr>
+      <w:tr>
+        <w:tc>
+          <w:tcPr>
+            <w:tcW w:type="dxa" w:w="4320"/>
+          </w:tcPr>
+          <w:p>
+            <w:r/>
+            <w:r>
+              <w:t>the same image as a saved tar</w:t>
+            </w:r>
+          </w:p>
+        </w:tc>
+        <w:tc>
+          <w:tcPr>
+            <w:tcW w:type="dxa" w:w="4320"/>
+          </w:tcPr>
+          <w:p>
+            <w:r/>
+            <w:r>
+              <w:rPr>
+                <w:b/>
+              </w:rPr>
+              <w:t>1.20 GB</w:t>
+            </w:r>
+          </w:p>
+        </w:tc>
+      </w:tr>
+      <w:tr>
+        <w:tc>
+          <w:tcPr>
+            <w:tcW w:type="dxa" w:w="4320"/>
+          </w:tcPr>
+          <w:p>
+            <w:r/>
+            <w:r>
+              <w:t xml:space="preserve">the clone plus its nine submodules, including </w:t>
+            </w:r>
+            <w:r>
+              <w:rPr>
+                <w:rFonts w:ascii="Consolas" w:hAnsi="Consolas"/>
+                <w:sz w:val="19"/>
+              </w:rPr>
+              <w:t>.git</w:t>
+            </w:r>
+          </w:p>
+        </w:tc>
+        <w:tc>
+          <w:tcPr>
+            <w:tcW w:type="dxa" w:w="4320"/>
+          </w:tcPr>
+          <w:p>
+            <w:r/>
+            <w:r>
+              <w:rPr>
+                <w:b/>
+              </w:rPr>
+              <w:t>0.60 GB</w:t>
+            </w:r>
+          </w:p>
+        </w:tc>
+      </w:tr>
+      <w:tr>
+        <w:tc>
+          <w:tcPr>
+            <w:tcW w:type="dxa" w:w="4320"/>
+          </w:tcPr>
+          <w:p>
+            <w:r/>
+            <w:r>
+              <w:t>the colcon workspace inside the container</w:t>
+            </w:r>
+          </w:p>
+        </w:tc>
+        <w:tc>
+          <w:tcPr>
+            <w:tcW w:type="dxa" w:w="4320"/>
+          </w:tcPr>
+          <w:p>
+            <w:r/>
+            <w:r>
+              <w:t>0.003 GB</w:t>
+            </w:r>
+          </w:p>
+        </w:tc>
+      </w:tr>
+      <w:tr>
+        <w:tc>
+          <w:tcPr>
+            <w:tcW w:type="dxa" w:w="4320"/>
+          </w:tcPr>
+          <w:p>
+            <w:r/>
+            <w:r>
+              <w:rPr>
+                <w:b/>
+              </w:rPr>
+              <w:t>total for the USB / offline path</w:t>
+            </w:r>
+          </w:p>
+        </w:tc>
+        <w:tc>
+          <w:tcPr>
+            <w:tcW w:type="dxa" w:w="4320"/>
+          </w:tcPr>
+          <w:p>
+            <w:r/>
+            <w:r>
+              <w:rPr>
+                <w:b/>
+              </w:rPr>
+              <w:t>7.4 GB</w:t>
+            </w:r>
+          </w:p>
+        </w:tc>
+      </w:tr>
+    </w:tbl>
+    <w:p/>
     <w:p>
-      <w:r>
-        <w:t xml:space="preserve">Docker Desktop -&gt; </w:t>
-      </w:r>
       <w:r>
         <w:rPr>
           <w:b/>
         </w:rPr>
-        <w:t>Settings</w:t>
-      </w:r>
-      <w:r>
-        <w:t xml:space="preserve"> -&gt; </w:t>
-      </w:r>
-      <w:r>
-        <w:rPr>
-          <w:b/>
-        </w:rPr>
-        <w:t>Resources</w:t>
-      </w:r>
-      <w:r>
-        <w:t xml:space="preserve"> -&gt; </w:t>
-      </w:r>
-      <w:r>
-        <w:rPr>
-          <w:b/>
-        </w:rPr>
-        <w:t>WSL Integration</w:t>
-      </w:r>
-      <w:r>
-        <w:t xml:space="preserve"> -&gt; enable the toggle for your distro (</w:t>
+        <w:t>Ask for 12 GB free if you are loading the image from a tar, and 25 GB if you are building it.</w:t>
+      </w:r>
+      <w:r>
+        <w:t xml:space="preserve"> The gap above the measured 7.4 GB is deliberate: the WSL2 VM's </w:t>
       </w:r>
       <w:r>
         <w:rPr>
           <w:rFonts w:ascii="Consolas" w:hAnsi="Consolas"/>
           <w:sz w:val="19"/>
         </w:rPr>
-        <w:t>Ubuntu-26.04</w:t>
-      </w:r>
-      <w:r>
-        <w:t xml:space="preserve">), then </w:t>
+        <w:t>docker_data.vhdx</w:t>
+      </w:r>
+      <w:r>
+        <w:t xml:space="preserve"> grows and never shrinks on its own, and one old image version usually lingers. The 25 GB build figure includes the build cache a build leaves behind, and that part is </w:t>
       </w:r>
       <w:r>
         <w:rPr>
           <w:b/>
         </w:rPr>
-        <w:t>Apply &amp; Restart</w:t>
-      </w:r>
-      <w:r>
-        <w:t>.</w:t>
+        <w:t>a margin, not a measurement</w:t>
+      </w:r>
+      <w:r>
+        <w:t>: this machine carries 29.06 GB of build cache across four images, 21.86 GB of it shared, so the share belonging to any single image cannot be cleanly attributed.</w:t>
       </w:r>
     </w:p>
     <w:p>
       <w:r>
-        <w:t>Check it worked, from the WSL2 shell:</w:t>
+        <w:t>If you are short, reclaim the cheapest thing first:</w:t>
       </w:r>
     </w:p>
     <w:p>
@@ -513,6 +834,120 @@
           <w:color w:val="113355"/>
           <w:sz w:val="18"/>
         </w:rPr>
+        <w:t>docker builder prune          # build cache, safe, usually the biggest win</w:t>
+        <w:br/>
+        <w:t>docker image prune -a         # images nothing is using</w:t>
+      </w:r>
+    </w:p>
+    <w:p>
+      <w:r>
+        <w:t xml:space="preserve">Be aware that pruning frees space *inside* the VM but </w:t>
+      </w:r>
+      <w:r>
+        <w:rPr>
+          <w:rFonts w:ascii="Consolas" w:hAnsi="Consolas"/>
+          <w:sz w:val="19"/>
+        </w:rPr>
+        <w:t>docker_data.vhdx</w:t>
+      </w:r>
+      <w:r>
+        <w:t xml:space="preserve"> on C: stays the same size. Windows 11 </w:t>
+      </w:r>
+      <w:r>
+        <w:rPr>
+          <w:b/>
+        </w:rPr>
+        <w:t>Home</w:t>
+      </w:r>
+      <w:r>
+        <w:t xml:space="preserve"> has no Hyper-V, so </w:t>
+      </w:r>
+      <w:r>
+        <w:rPr>
+          <w:rFonts w:ascii="Consolas" w:hAnsi="Consolas"/>
+          <w:sz w:val="19"/>
+        </w:rPr>
+        <w:t>Optimize-VHD</w:t>
+      </w:r>
+      <w:r>
+        <w:t xml:space="preserve"> is not available to shrink it.</w:t>
+      </w:r>
+    </w:p>
+    <w:p>
+      <w:pPr>
+        <w:pStyle w:val="Heading3"/>
+      </w:pPr>
+      <w:r>
+        <w:t>WSL Integration is the one people miss</w:t>
+      </w:r>
+    </w:p>
+    <w:p>
+      <w:r>
+        <w:t xml:space="preserve">Docker Desktop, </w:t>
+      </w:r>
+      <w:r>
+        <w:rPr>
+          <w:b/>
+        </w:rPr>
+        <w:t>Settings</w:t>
+      </w:r>
+      <w:r>
+        <w:t xml:space="preserve">, </w:t>
+      </w:r>
+      <w:r>
+        <w:rPr>
+          <w:b/>
+        </w:rPr>
+        <w:t>Resources</w:t>
+      </w:r>
+      <w:r>
+        <w:t xml:space="preserve">, </w:t>
+      </w:r>
+      <w:r>
+        <w:rPr>
+          <w:b/>
+        </w:rPr>
+        <w:t>WSL Integration</w:t>
+      </w:r>
+      <w:r>
+        <w:t>, enable the toggle for your distro (</w:t>
+      </w:r>
+      <w:r>
+        <w:rPr>
+          <w:rFonts w:ascii="Consolas" w:hAnsi="Consolas"/>
+          <w:sz w:val="19"/>
+        </w:rPr>
+        <w:t>Ubuntu-26.04</w:t>
+      </w:r>
+      <w:r>
+        <w:t xml:space="preserve">), then </w:t>
+      </w:r>
+      <w:r>
+        <w:rPr>
+          <w:b/>
+        </w:rPr>
+        <w:t>Apply &amp; Restart</w:t>
+      </w:r>
+      <w:r>
+        <w:t>.</w:t>
+      </w:r>
+    </w:p>
+    <w:p>
+      <w:r>
+        <w:t>Check it worked, from the WSL2 shell:</w:t>
+      </w:r>
+    </w:p>
+    <w:p>
+      <w:pPr>
+        <w:spacing w:after="200" w:before="120"/>
+        <w:ind w:left="432"/>
+      </w:pPr>
+      <w:r>
+        <w:rPr>
+          <w:rFonts w:ascii="Consolas" w:hAnsi="Consolas"/>
+          <w:color w:val="113355"/>
+          <w:sz w:val="18"/>
+        </w:rPr>
         <w:t>docker ps</w:t>
       </w:r>
     </w:p>
@@ -541,7 +976,7 @@
         <w:t>one</w:t>
       </w:r>
       <w:r>
-        <w:t xml:space="preserve"> laptop: Windows 11, RTX 5070 Ti Laptop, Docker Desktop 29.7.2, WSL2 Ubuntu-26.04. If your machine differs, find it below </w:t>
+        <w:t xml:space="preserve"> laptop. If your machine differs, find it below </w:t>
       </w:r>
       <w:r>
         <w:rPr>
@@ -551,14 +986,6 @@
       </w:r>
       <w:r>
         <w:t xml:space="preserve"> you conclude something is broken. Most "it works for you and not for me" reports on this project have turned out to be one of these.</w:t>
-      </w:r>
-    </w:p>
-    <w:p>
-      <w:pPr>
-        <w:pStyle w:val="Heading3"/>
-      </w:pPr>
-      <w:r>
-        <w:t>Which parts are machine-specific</w:t>
       </w:r>
     </w:p>
     <w:tbl>
@@ -617,7 +1044,7 @@
           <w:p>
             <w:r/>
             <w:r>
-              <w:t>Building the image</w:t>
+              <w:t>Getting the image</w:t>
             </w:r>
           </w:p>
         </w:tc>
@@ -628,7 +1055,7 @@
           <w:p>
             <w:r/>
             <w:r>
-              <w:t>No. Same everywhere with Docker + internet</w:t>
+              <w:t>No. Same everywhere</w:t>
             </w:r>
           </w:p>
         </w:tc>
@@ -742,7 +1169,7 @@
           <w:p>
             <w:r/>
             <w:r>
-              <w:t>Yes. Cameras are the expensive part; see the last table in section 9</w:t>
+              <w:t>Yes. Cameras are the expensive part</w:t>
             </w:r>
           </w:p>
         </w:tc>
@@ -760,7 +1187,7 @@
         <w:t>does not require an NVIDIA GPU to run at all.</w:t>
       </w:r>
       <w:r>
-        <w:t xml:space="preserve"> It requires one to run *fast* and to make camera results meaningful. If you have no usable GPU, you can still do navigation, lidar and control work today - see "No usable GPU" below.</w:t>
+        <w:t xml:space="preserve"> It requires one to run *fast* and to make camera results meaningful. With no usable GPU you can still do navigation, lidar and control work today.</w:t>
       </w:r>
     </w:p>
     <w:p>
@@ -786,16 +1213,152 @@
     </w:p>
     <w:p>
       <w:r>
-        <w:t xml:space="preserve">Works, with one condition: </w:t>
-      </w:r>
-      <w:r>
-        <w:rPr>
-          <w:b/>
-        </w:rPr>
-        <w:t>WSLg needs build 19044 or newer</w:t>
-      </w:r>
-      <w:r>
-        <w:t xml:space="preserve"> (21H2+). Check with </w:t>
+        <w:t>Works, and one teammate is on it. Three different build numbers matter and they are easy to conflate:</w:t>
+      </w:r>
+    </w:p>
+    <w:tbl>
+      <w:tblPr>
+        <w:tblStyle w:val="LightGrid-Accent1"/>
+        <w:tblW w:type="auto" w:w="0"/>
+        <w:tblLook w:firstColumn="1" w:firstRow="1" w:lastColumn="0" w:lastRow="0" w:noHBand="0" w:noVBand="1" w:val="04A0"/>
+      </w:tblPr>
+      <w:tblGrid>
+        <w:gridCol w:w="4320"/>
+        <w:gridCol w:w="4320"/>
+      </w:tblGrid>
+      <w:tr>
+        <w:tc>
+          <w:tcPr>
+            <w:tcW w:type="dxa" w:w="4320"/>
+          </w:tcPr>
+          <w:p>
+            <w:r>
+              <w:rPr>
+                <w:b/>
+              </w:rPr>
+            </w:r>
+            <w:r>
+              <w:rPr>
+                <w:b/>
+              </w:rPr>
+              <w:t>Build</w:t>
+            </w:r>
+          </w:p>
+        </w:tc>
+        <w:tc>
+          <w:tcPr>
+            <w:tcW w:type="dxa" w:w="4320"/>
+          </w:tcPr>
+          <w:p>
+            <w:r>
+              <w:rPr>
+                <w:b/>
+              </w:rPr>
+            </w:r>
+            <w:r>
+              <w:rPr>
+                <w:b/>
+              </w:rPr>
+              <w:t>What it gates</w:t>
+            </w:r>
+          </w:p>
+        </w:tc>
+      </w:tr>
+      <w:tr>
+        <w:tc>
+          <w:tcPr>
+            <w:tcW w:type="dxa" w:w="4320"/>
+          </w:tcPr>
+          <w:p>
+            <w:r/>
+            <w:r>
+              <w:t>19041</w:t>
+            </w:r>
+          </w:p>
+        </w:tc>
+        <w:tc>
+          <w:tcPr>
+            <w:tcW w:type="dxa" w:w="4320"/>
+          </w:tcPr>
+          <w:p>
+            <w:r/>
+            <w:r>
+              <w:t>WSL2 itself</w:t>
+            </w:r>
+          </w:p>
+        </w:tc>
+      </w:tr>
+      <w:tr>
+        <w:tc>
+          <w:tcPr>
+            <w:tcW w:type="dxa" w:w="4320"/>
+          </w:tcPr>
+          <w:p>
+            <w:r/>
+            <w:r>
+              <w:rPr>
+                <w:b/>
+              </w:rPr>
+              <w:t>19044</w:t>
+            </w:r>
+            <w:r>
+              <w:t xml:space="preserve"> (21H2)</w:t>
+            </w:r>
+          </w:p>
+        </w:tc>
+        <w:tc>
+          <w:tcPr>
+            <w:tcW w:type="dxa" w:w="4320"/>
+          </w:tcPr>
+          <w:p>
+            <w:r/>
+            <w:r>
+              <w:rPr>
+                <w:b/>
+              </w:rPr>
+              <w:t>WSLg, that is, whether a Linux window can ever appear</w:t>
+            </w:r>
+          </w:p>
+        </w:tc>
+      </w:tr>
+      <w:tr>
+        <w:tc>
+          <w:tcPr>
+            <w:tcW w:type="dxa" w:w="4320"/>
+          </w:tcPr>
+          <w:p>
+            <w:r/>
+            <w:r>
+              <w:rPr>
+                <w:b/>
+              </w:rPr>
+              <w:t>19045</w:t>
+            </w:r>
+            <w:r>
+              <w:t xml:space="preserve"> (22H2)</w:t>
+            </w:r>
+          </w:p>
+        </w:tc>
+        <w:tc>
+          <w:tcPr>
+            <w:tcW w:type="dxa" w:w="4320"/>
+          </w:tcPr>
+          <w:p>
+            <w:r/>
+            <w:r>
+              <w:rPr>
+                <w:b/>
+              </w:rPr>
+              <w:t>what current Docker Desktop requires</w:t>
+            </w:r>
+          </w:p>
+        </w:tc>
+      </w:tr>
+    </w:tbl>
+    <w:p/>
+    <w:p>
+      <w:r>
+        <w:t xml:space="preserve">Check yours with </w:t>
       </w:r>
       <w:r>
         <w:rPr>
@@ -805,41 +1368,32 @@
         <w:t>winver</w:t>
       </w:r>
       <w:r>
-        <w:t>. Below that you get no windows at all - headless still works, and so does every check except the RViz one.</w:t>
-      </w:r>
-    </w:p>
-    <w:p>
-      <w:r>
-        <w:t xml:space="preserve">Install WSL from the Microsoft Store rather than the older Windows feature, or </w:t>
-      </w:r>
-      <w:r>
-        <w:rPr>
-          <w:rFonts w:ascii="Consolas" w:hAnsi="Consolas"/>
-          <w:sz w:val="19"/>
-        </w:rPr>
-        <w:t>wsl --update</w:t>
-      </w:r>
-      <w:r>
-        <w:t>, then confirm:</w:t>
+        <w:t>.</w:t>
       </w:r>
     </w:p>
     <w:p>
       <w:pPr>
-        <w:spacing w:after="200" w:before="120"/>
-        <w:ind w:left="432"/>
+        <w:pStyle w:val="ListBullet"/>
       </w:pPr>
       <w:r>
         <w:rPr>
-          <w:rFonts w:ascii="Consolas" w:hAnsi="Consolas"/>
-          <w:color w:val="113355"/>
-          <w:sz w:val="18"/>
+          <w:b/>
         </w:rPr>
-        <w:t>wsl --version</w:t>
+        <w:t>19045 or newer:</w:t>
+      </w:r>
+      <w:r>
+        <w:t xml:space="preserve"> supported. But you must install WSL from the **Microsoft</w:t>
       </w:r>
     </w:p>
     <w:p>
       <w:r>
-        <w:t xml:space="preserve">You want a </w:t>
+        <w:t>Store</w:t>
+      </w:r>
+      <w:r>
+        <w:rPr>
+          <w:b/>
+        </w:rPr>
+        <w:t xml:space="preserve">, not the older "Windows Subsystem for Linux" Windows feature, because the feature version has no WSLg and gives you no windows at all. Run `wsl --update`, then confirm `wsl --version` prints a </w:t>
       </w:r>
       <w:r>
         <w:rPr>
@@ -849,7 +1403,115 @@
         <w:t>WSLg version</w:t>
       </w:r>
       <w:r>
-        <w:t xml:space="preserve"> line. No line, no windows.</w:t>
+        <w:t>** line. No line, no windows.</w:t>
+      </w:r>
+    </w:p>
+    <w:p>
+      <w:pPr>
+        <w:pStyle w:val="ListBullet"/>
+      </w:pPr>
+      <w:r>
+        <w:rPr>
+          <w:b/>
+        </w:rPr>
+        <w:t>19044:</w:t>
+      </w:r>
+      <w:r>
+        <w:t xml:space="preserve"> you have WSLg but current Docker Desktop will refuse to install.</w:t>
+      </w:r>
+    </w:p>
+    <w:p>
+      <w:r>
+        <w:rPr>
+          <w:b/>
+        </w:rPr>
+        <w:t>What to do:</w:t>
+      </w:r>
+      <w:r>
+        <w:t xml:space="preserve"> update to 22H2 through Settings, Windows Update. It is one optional update away and it is the whole fix.</w:t>
+      </w:r>
+    </w:p>
+    <w:p>
+      <w:pPr>
+        <w:pStyle w:val="ListBullet"/>
+      </w:pPr>
+      <w:r>
+        <w:rPr>
+          <w:b/>
+        </w:rPr>
+        <w:t>19041 to 19043:</w:t>
+      </w:r>
+      <w:r>
+        <w:t xml:space="preserve"> this machine can </w:t>
+      </w:r>
+      <w:r>
+        <w:rPr>
+          <w:b/>
+        </w:rPr>
+        <w:t>never</w:t>
+      </w:r>
+      <w:r>
+        <w:t xml:space="preserve"> show a Gazebo or RViz window,</w:t>
+      </w:r>
+    </w:p>
+    <w:p>
+      <w:r>
+        <w:t xml:space="preserve">whatever else you install. There is no workaround short of updating Windows. </w:t>
+      </w:r>
+      <w:r>
+        <w:rPr>
+          <w:b/>
+        </w:rPr>
+        <w:t>What to do:</w:t>
+      </w:r>
+      <w:r>
+        <w:t xml:space="preserve"> update to 22H2. Meanwhile the machine is still useful headless: </w:t>
+      </w:r>
+      <w:r>
+        <w:rPr>
+          <w:rFonts w:ascii="Consolas" w:hAnsi="Consolas"/>
+          <w:sz w:val="19"/>
+        </w:rPr>
+        <w:t>render_check.sh</w:t>
+      </w:r>
+      <w:r>
+        <w:t xml:space="preserve">, the smoke test and </w:t>
+      </w:r>
+      <w:r>
+        <w:rPr>
+          <w:rFonts w:ascii="Consolas" w:hAnsi="Consolas"/>
+          <w:sz w:val="19"/>
+        </w:rPr>
+        <w:t>autonomy_check.sh</w:t>
+      </w:r>
+      <w:r>
+        <w:t xml:space="preserve"> all run with no display. Pair with someone whose machine shows windows for anything visual.</w:t>
+      </w:r>
+    </w:p>
+    <w:p>
+      <w:pPr>
+        <w:pStyle w:val="ListBullet"/>
+      </w:pPr>
+      <w:r>
+        <w:rPr>
+          <w:b/>
+        </w:rPr>
+        <w:t>Below 19041:</w:t>
+      </w:r>
+      <w:r>
+        <w:t xml:space="preserve"> nothing here works. Update Windows first.</w:t>
+      </w:r>
+    </w:p>
+    <w:p>
+      <w:r>
+        <w:rPr>
+          <w:rFonts w:ascii="Consolas" w:hAnsi="Consolas"/>
+          <w:sz w:val="19"/>
+        </w:rPr>
+        <w:t>scripts/setup-windows.ps1</w:t>
+      </w:r>
+      <w:r>
+        <w:t xml:space="preserve"> prints your build number and which of these you are in.</w:t>
       </w:r>
     </w:p>
     <w:p>
@@ -890,16 +1552,16 @@
     </w:p>
     <w:p>
       <w:r>
-        <w:t xml:space="preserve">That service is new as of 2026-09-15 and is </w:t>
+        <w:t xml:space="preserve">That service is </w:t>
       </w:r>
       <w:r>
         <w:rPr>
           <w:b/>
         </w:rPr>
-        <w:t>not yet verified on a real Linux machine</w:t>
-      </w:r>
-      <w:r>
-        <w:t xml:space="preserve"> - nobody on the team runs Linux on the desktop. It is the Windows service with the WSL-specific machinery swapped for </w:t>
+        <w:t>written but has never been run on a real Linux machine</w:t>
+      </w:r>
+      <w:r>
+        <w:t xml:space="preserve">, because nobody on the team runs Linux on the desktop. It is the Windows service with the WSL-specific machinery swapped for </w:t>
       </w:r>
       <w:r>
         <w:rPr>
@@ -939,7 +1601,7 @@
         <w:t>nvidia-container-toolkit</w:t>
       </w:r>
       <w:r>
-        <w:t xml:space="preserve"> not being installed, and forgetting </w:t>
+        <w:t xml:space="preserve"> not being installed and forgetting </w:t>
       </w:r>
       <w:r>
         <w:rPr>
@@ -1006,7 +1668,7 @@
         <w:t>NVIDIA</w:t>
       </w:r>
       <w:r>
-        <w:t xml:space="preserve"> to a string matching your adapter, or delete the line to let Mesa choose. On native Linux, drop </w:t>
+        <w:t xml:space="preserve"> to a string matching your adapter, or delete the line and let Mesa choose. On native Linux, drop </w:t>
       </w:r>
       <w:r>
         <w:rPr>
@@ -1061,7 +1723,7 @@
         <w:t>render_check.sh</w:t>
       </w:r>
       <w:r>
-        <w:t xml:space="preserve"> and see what it reports. A modern AMD or Intel GPU will render this scene perfectly well; the pinning exists only because </w:t>
+        <w:t xml:space="preserve"> and see what it reports. A modern AMD or Intel GPU will render this scene perfectly well. The pinning exists only because </w:t>
       </w:r>
       <w:r>
         <w:rPr>
@@ -1121,12 +1783,12 @@
         <w:t>CAMERAS=none</w:t>
       </w:r>
       <w:r>
-        <w:t>. They are what software rendering</w:t>
+        <w:t>. They are what software rendering cannot</w:t>
       </w:r>
     </w:p>
     <w:p>
       <w:r>
-        <w:t>cannot keep up with.</w:t>
+        <w:t>keep up with.</w:t>
       </w:r>
     </w:p>
     <w:p>
@@ -1168,7 +1830,7 @@
         <w:t>gpu_lidar</w:t>
       </w:r>
       <w:r>
-        <w:t xml:space="preserve"> falls back too and the physics is on the CPU regardless. Run:</w:t>
+        <w:t xml:space="preserve"> falls back too and the physics is on the CPU regardless:</w:t>
       </w:r>
     </w:p>
     <w:p>
@@ -1197,7 +1859,7 @@
     </w:p>
     <w:p>
       <w:r>
-        <w:t>Not supported. Docker Desktop on macOS gives containers no GPU, and there is no WSLg equivalent. Software rendering in a VM is the only option and it is not worth the trouble. Use a lab machine.</w:t>
+        <w:t>Not supported. Docker Desktop on macOS gives containers no GPU and there is no WSLg equivalent. Use a lab machine.</w:t>
       </w:r>
     </w:p>
     <w:p>
@@ -1210,7 +1872,7 @@
     </w:p>
     <w:p>
       <w:r>
-        <w:t>The default allocation is often too small once Gazebo, RViz and ten Nav2 nodes are running. Settings -&gt; Resources:</w:t>
+        <w:t>The default allocation is often too small once Gazebo, RViz and ten Nav2 nodes are running. Settings, Resources:</w:t>
       </w:r>
     </w:p>
     <w:tbl>
@@ -1323,41 +1985,6 @@
           <w:p>
             <w:r/>
             <w:r>
-              <w:t>Disk</w:t>
-            </w:r>
-          </w:p>
-        </w:tc>
-        <w:tc>
-          <w:tcPr>
-            <w:tcW w:type="dxa" w:w="2880"/>
-          </w:tcPr>
-          <w:p>
-            <w:r/>
-            <w:r>
-              <w:t>15 GB free</w:t>
-            </w:r>
-          </w:p>
-        </w:tc>
-        <w:tc>
-          <w:tcPr>
-            <w:tcW w:type="dxa" w:w="2880"/>
-          </w:tcPr>
-          <w:p>
-            <w:r/>
-            <w:r>
-              <w:t>30 GB</w:t>
-            </w:r>
-          </w:p>
-        </w:tc>
-      </w:tr>
-      <w:tr>
-        <w:tc>
-          <w:tcPr>
-            <w:tcW w:type="dxa" w:w="2880"/>
-          </w:tcPr>
-          <w:p>
-            <w:r/>
-            <w:r>
               <w:t>CPUs</w:t>
             </w:r>
           </w:p>
@@ -1412,6 +2039,42 @@
       </w:r>
     </w:p>
     <w:p>
+      <w:r>
+        <w:rPr>
+          <w:b/>
+        </w:rPr>
+        <w:t>The `--recurse-submodules` is not optional.</w:t>
+      </w:r>
+      <w:r>
+        <w:t xml:space="preserve"> This is the single most common way a fresh clone fails, and the failure is confusing when it happens. </w:t>
+      </w:r>
+      <w:r>
+        <w:rPr>
+          <w:rFonts w:ascii="Consolas" w:hAnsi="Consolas"/>
+          <w:sz w:val="19"/>
+        </w:rPr>
+        <w:t>zed_description</w:t>
+      </w:r>
+      <w:r>
+        <w:t xml:space="preserve"> is a submodule and colcon builds it by name, so without it the workspace build fails outright; </w:t>
+      </w:r>
+      <w:r>
+        <w:rPr>
+          <w:rFonts w:ascii="Consolas" w:hAnsi="Consolas"/>
+          <w:sz w:val="19"/>
+        </w:rPr>
+        <w:t>IGVC_track_generator</w:t>
+      </w:r>
+      <w:r>
+        <w:t xml:space="preserve"> holds the track data that every navigation node and the world generator read.</w:t>
+      </w:r>
+    </w:p>
+    <w:p>
+      <w:r>
+        <w:t>From the WSL2 shell:</w:t>
+      </w:r>
+    </w:p>
+    <w:p>
       <w:pPr>
         <w:spacing w:after="200" w:before="120"/>
         <w:ind w:left="432"/>
@@ -1424,23 +2087,14 @@
         </w:rPr>
         <w:t>cd /mnt/c            # or wherever you keep projects</w:t>
         <w:br/>
-        <w:t>git clone https://github.com/wworth-IGVC/IGVC_robot_2027.git</w:t>
+        <w:t>git clone --recurse-submodules https://github.com/wworth-IGVC/IGVC_robot_2027.git</w:t>
         <w:br/>
         <w:t>cd IGVC_robot_2027</w:t>
       </w:r>
     </w:p>
     <w:p>
       <w:r>
-        <w:t xml:space="preserve">If you already have it somewhere with a space in the path, that is fine, but </w:t>
-      </w:r>
-      <w:r>
-        <w:rPr>
-          <w:b/>
-        </w:rPr>
-        <w:t>quote it everywhere</w:t>
-      </w:r>
-      <w:r>
-        <w:t>:</w:t>
+        <w:t>Expect nine submodules. Check:</w:t>
       </w:r>
     </w:p>
     <w:p>
@@ -1454,6 +2108,73 @@
           <w:color w:val="113355"/>
           <w:sz w:val="18"/>
         </w:rPr>
+        <w:t>git submodule status | wc -l          # want: 9</w:t>
+        <w:br/>
+        <w:t>git submodule status | grep '^-'      # want: no output. A leading - means empty</w:t>
+      </w:r>
+    </w:p>
+    <w:p>
+      <w:r>
+        <w:rPr>
+          <w:b/>
+        </w:rPr>
+        <w:t>If you already cloned without it</w:t>
+      </w:r>
+      <w:r>
+        <w:t>, you do not need to start again:</w:t>
+      </w:r>
+    </w:p>
+    <w:p>
+      <w:pPr>
+        <w:spacing w:after="200" w:before="120"/>
+        <w:ind w:left="432"/>
+      </w:pPr>
+      <w:r>
+        <w:rPr>
+          <w:rFonts w:ascii="Consolas" w:hAnsi="Consolas"/>
+          <w:color w:val="113355"/>
+          <w:sz w:val="18"/>
+        </w:rPr>
+        <w:t>git submodule update --init --recursive</w:t>
+      </w:r>
+    </w:p>
+    <w:p>
+      <w:r>
+        <w:rPr>
+          <w:rFonts w:ascii="Consolas" w:hAnsi="Consolas"/>
+          <w:sz w:val="19"/>
+        </w:rPr>
+        <w:t>bootstrap.sh</w:t>
+      </w:r>
+      <w:r>
+        <w:t xml:space="preserve"> in section 4 does this for you and refuses to continue if any submodule is still empty, so you cannot get far with the wrong clone.</w:t>
+      </w:r>
+    </w:p>
+    <w:p>
+      <w:r>
+        <w:t xml:space="preserve">If your path contains a space, that is fine, but </w:t>
+      </w:r>
+      <w:r>
+        <w:rPr>
+          <w:b/>
+        </w:rPr>
+        <w:t>quote it everywhere</w:t>
+      </w:r>
+      <w:r>
+        <w:t>:</w:t>
+      </w:r>
+    </w:p>
+    <w:p>
+      <w:pPr>
+        <w:spacing w:after="200" w:before="120"/>
+        <w:ind w:left="432"/>
+      </w:pPr>
+      <w:r>
+        <w:rPr>
+          <w:rFonts w:ascii="Consolas" w:hAnsi="Consolas"/>
+          <w:color w:val="113355"/>
+          <w:sz w:val="18"/>
+        </w:rPr>
         <w:t>cd "/mnt/c/IGVC 2027/IGVC_robot_2027"</w:t>
       </w:r>
     </w:p>
@@ -1463,12 +2184,12 @@
         <w:pStyle w:val="Heading2"/>
       </w:pPr>
       <w:r>
-        <w:t>3. Build the image</w:t>
+        <w:t>3. Check your machine, from PowerShell</w:t>
       </w:r>
     </w:p>
     <w:p>
       <w:r>
-        <w:t>From the WSL2 shell, in the repo root:</w:t>
+        <w:t>This one script is meant for PowerShell, because all it does is read your machine's configuration. It builds nothing and starts nothing.</w:t>
       </w:r>
     </w:p>
     <w:p>
@@ -1482,55 +2203,70 @@
           <w:color w:val="113355"/>
           <w:sz w:val="18"/>
         </w:rPr>
-        <w:t>docker compose -f docker-compose.windows.yml build igvc_gazebo</w:t>
+        <w:t>cd "C:\IGVC 2027\IGVC_robot_2027"</w:t>
+        <w:br/>
+        <w:t>.\scripts\setup-windows.ps1</w:t>
       </w:r>
     </w:p>
     <w:p>
       <w:r>
-        <w:t xml:space="preserve">Ten to twenty minutes the first time; it downloads ROS 2 Jazzy, Gazebo Harmonic and Nav2. The result is </w:t>
+        <w:t>It checks the Windows build against all three thresholds above, WSL2, Docker, GPU passthrough, free disk (printing both the number it wants and the number it found) and whether your submodules are populated. Every failure comes with what to do about it.</w:t>
+      </w:r>
+    </w:p>
+    <w:p>
+      <w:r>
+        <w:t>Expect it to end with:</w:t>
+      </w:r>
+    </w:p>
+    <w:p>
+      <w:pPr>
+        <w:spacing w:after="200" w:before="120"/>
+        <w:ind w:left="432"/>
+      </w:pPr>
+      <w:r>
+        <w:rPr>
+          <w:rFonts w:ascii="Consolas" w:hAnsi="Consolas"/>
+          <w:color w:val="113355"/>
+          <w:sz w:val="18"/>
+        </w:rPr>
+        <w:t xml:space="preserve">  All required checks passed.</w:t>
+        <w:br/>
+        <w:t xml:space="preserve">  Prerequisites are in place. Nothing was built.</w:t>
+      </w:r>
+    </w:p>
+    <w:p>
+      <w:r>
+        <w:t xml:space="preserve">Switches: </w:t>
       </w:r>
       <w:r>
         <w:rPr>
           <w:rFonts w:ascii="Consolas" w:hAnsi="Consolas"/>
           <w:sz w:val="19"/>
         </w:rPr>
-        <w:t>igvc-gazebo-jazzy:latest</w:t>
-      </w:r>
-      <w:r>
-        <w:t xml:space="preserve">, about </w:t>
-      </w:r>
-      <w:r>
-        <w:rPr>
-          <w:b/>
-        </w:rPr>
-        <w:t>5.6 GB</w:t>
-      </w:r>
-      <w:r>
-        <w:t>. Later builds are cached and take seconds unless the Dockerfile changed.</w:t>
-      </w:r>
-    </w:p>
-    <w:p>
-      <w:r>
-        <w:t xml:space="preserve">Note the file: </w:t>
-      </w:r>
-      <w:r>
-        <w:rPr>
-          <w:b/>
-        </w:rPr>
-        <w:t>`docker-compose.windows.yml`</w:t>
-      </w:r>
-      <w:r>
-        <w:t xml:space="preserve">, not the plain </w:t>
+        <w:t>-WithPerception</w:t>
+      </w:r>
+      <w:r>
+        <w:t xml:space="preserve"> and </w:t>
       </w:r>
       <w:r>
         <w:rPr>
           <w:rFonts w:ascii="Consolas" w:hAnsi="Consolas"/>
           <w:sz w:val="19"/>
         </w:rPr>
-        <w:t>docker-compose.yml</w:t>
-      </w:r>
-      <w:r>
-        <w:t>. The plain one targets native Linux and will not work here.</w:t>
+        <w:t>-WithZed</w:t>
+      </w:r>
+      <w:r>
+        <w:t xml:space="preserve"> raise the disk requirement for those much larger images, which the simulator does not need. </w:t>
+      </w:r>
+      <w:r>
+        <w:rPr>
+          <w:rFonts w:ascii="Consolas" w:hAnsi="Consolas"/>
+          <w:sz w:val="19"/>
+        </w:rPr>
+        <w:t>-Weights</w:t>
+      </w:r>
+      <w:r>
+        <w:t xml:space="preserve"> downloads the YOLOPv2 model weights, which the simulator does not use.</w:t>
       </w:r>
     </w:p>
     <w:p/>
@@ -1539,7 +2275,21 @@
         <w:pStyle w:val="Heading2"/>
       </w:pPr>
       <w:r>
-        <w:t>4. Start the container</w:t>
+        <w:t>4. One command: get the image, build, and verify</w:t>
+      </w:r>
+    </w:p>
+    <w:p>
+      <w:r>
+        <w:t xml:space="preserve">Back in the </w:t>
+      </w:r>
+      <w:r>
+        <w:rPr>
+          <w:b/>
+        </w:rPr>
+        <w:t>WSL2</w:t>
+      </w:r>
+      <w:r>
+        <w:t xml:space="preserve"> shell, in the repo root:</w:t>
       </w:r>
     </w:p>
     <w:p>
@@ -1553,10 +2303,462 @@
           <w:color w:val="113355"/>
           <w:sz w:val="18"/>
         </w:rPr>
-        <w:t>docker compose -f docker-compose.windows.yml up -d igvc_gazebo</w:t>
+        <w:t>bash scripts/gazebo/bootstrap.sh</w:t>
       </w:r>
     </w:p>
     <w:p>
+      <w:r>
+        <w:t xml:space="preserve">That does everything: submodules, the image, the container, the workspace build, the GPU check and the smoke test. It prints </w:t>
+      </w:r>
+      <w:r>
+        <w:rPr>
+          <w:rFonts w:ascii="Consolas" w:hAnsi="Consolas"/>
+          <w:sz w:val="19"/>
+        </w:rPr>
+        <w:t>PASS</w:t>
+      </w:r>
+      <w:r>
+        <w:t xml:space="preserve"> or </w:t>
+      </w:r>
+      <w:r>
+        <w:rPr>
+          <w:rFonts w:ascii="Consolas" w:hAnsi="Consolas"/>
+          <w:sz w:val="19"/>
+        </w:rPr>
+        <w:t>FAIL</w:t>
+      </w:r>
+      <w:r>
+        <w:t xml:space="preserve"> for each step and </w:t>
+      </w:r>
+      <w:r>
+        <w:rPr>
+          <w:b/>
+        </w:rPr>
+        <w:t>stops at the first failure</w:t>
+      </w:r>
+      <w:r>
+        <w:t xml:space="preserve"> rather than half-succeeding.</w:t>
+      </w:r>
+    </w:p>
+    <w:p>
+      <w:r>
+        <w:rPr>
+          <w:b/>
+        </w:rPr>
+        <w:t>If someone handed you the image on a USB drive, use it.</w:t>
+      </w:r>
+      <w:r>
+        <w:t xml:space="preserve"> This skips the download and the build entirely, which matters when twelve people are on the same campus wifi. From WSL2, a USB drive mounted at </w:t>
+      </w:r>
+      <w:r>
+        <w:rPr>
+          <w:rFonts w:ascii="Consolas" w:hAnsi="Consolas"/>
+          <w:sz w:val="19"/>
+        </w:rPr>
+        <w:t>D:</w:t>
+      </w:r>
+      <w:r>
+        <w:t xml:space="preserve"> is </w:t>
+      </w:r>
+      <w:r>
+        <w:rPr>
+          <w:rFonts w:ascii="Consolas" w:hAnsi="Consolas"/>
+          <w:sz w:val="19"/>
+        </w:rPr>
+        <w:t>/mnt/d</w:t>
+      </w:r>
+      <w:r>
+        <w:t>:</w:t>
+      </w:r>
+    </w:p>
+    <w:p>
+      <w:pPr>
+        <w:spacing w:after="200" w:before="120"/>
+        <w:ind w:left="432"/>
+      </w:pPr>
+      <w:r>
+        <w:rPr>
+          <w:rFonts w:ascii="Consolas" w:hAnsi="Consolas"/>
+          <w:color w:val="113355"/>
+          <w:sz w:val="18"/>
+        </w:rPr>
+        <w:t>IMAGE_TAR=/mnt/d/igvc-gazebo-jazzy.tar bash scripts/gazebo/bootstrap.sh</w:t>
+      </w:r>
+    </w:p>
+    <w:p>
+      <w:r>
+        <w:t>Other options:</w:t>
+      </w:r>
+    </w:p>
+    <w:tbl>
+      <w:tblPr>
+        <w:tblStyle w:val="LightGrid-Accent1"/>
+        <w:tblW w:type="auto" w:w="0"/>
+        <w:tblLook w:firstColumn="1" w:firstRow="1" w:lastColumn="0" w:lastRow="0" w:noHBand="0" w:noVBand="1" w:val="04A0"/>
+      </w:tblPr>
+      <w:tblGrid>
+        <w:gridCol w:w="4320"/>
+        <w:gridCol w:w="4320"/>
+      </w:tblGrid>
+      <w:tr>
+        <w:tc>
+          <w:tcPr>
+            <w:tcW w:type="dxa" w:w="4320"/>
+          </w:tcPr>
+          <w:p>
+            <w:r>
+              <w:rPr>
+                <w:b/>
+              </w:rPr>
+            </w:r>
+            <w:r>
+              <w:rPr>
+                <w:b/>
+              </w:rPr>
+              <w:t>Variable</w:t>
+            </w:r>
+          </w:p>
+        </w:tc>
+        <w:tc>
+          <w:tcPr>
+            <w:tcW w:type="dxa" w:w="4320"/>
+          </w:tcPr>
+          <w:p>
+            <w:r>
+              <w:rPr>
+                <w:b/>
+              </w:rPr>
+            </w:r>
+            <w:r>
+              <w:rPr>
+                <w:b/>
+              </w:rPr>
+              <w:t>Effect</w:t>
+            </w:r>
+          </w:p>
+        </w:tc>
+      </w:tr>
+      <w:tr>
+        <w:tc>
+          <w:tcPr>
+            <w:tcW w:type="dxa" w:w="4320"/>
+          </w:tcPr>
+          <w:p>
+            <w:r/>
+            <w:r>
+              <w:rPr>
+                <w:rFonts w:ascii="Consolas" w:hAnsi="Consolas"/>
+                <w:sz w:val="19"/>
+              </w:rPr>
+              <w:t>IMAGE_TAR=&lt;path&gt;</w:t>
+            </w:r>
+          </w:p>
+        </w:tc>
+        <w:tc>
+          <w:tcPr>
+            <w:tcW w:type="dxa" w:w="4320"/>
+          </w:tcPr>
+          <w:p>
+            <w:r/>
+            <w:r>
+              <w:t>load the image from a tar instead of building it</w:t>
+            </w:r>
+          </w:p>
+        </w:tc>
+      </w:tr>
+      <w:tr>
+        <w:tc>
+          <w:tcPr>
+            <w:tcW w:type="dxa" w:w="4320"/>
+          </w:tcPr>
+          <w:p>
+            <w:r/>
+            <w:r>
+              <w:rPr>
+                <w:rFonts w:ascii="Consolas" w:hAnsi="Consolas"/>
+                <w:sz w:val="19"/>
+              </w:rPr>
+              <w:t>SKIP_SMOKE=1</w:t>
+            </w:r>
+          </w:p>
+        </w:tc>
+        <w:tc>
+          <w:tcPr>
+            <w:tcW w:type="dxa" w:w="4320"/>
+          </w:tcPr>
+          <w:p>
+            <w:r/>
+            <w:r>
+              <w:t>stop after the GPU check. Saves about 4 minutes</w:t>
+            </w:r>
+          </w:p>
+        </w:tc>
+      </w:tr>
+      <w:tr>
+        <w:tc>
+          <w:tcPr>
+            <w:tcW w:type="dxa" w:w="4320"/>
+          </w:tcPr>
+          <w:p>
+            <w:r/>
+            <w:r>
+              <w:rPr>
+                <w:rFonts w:ascii="Consolas" w:hAnsi="Consolas"/>
+                <w:sz w:val="19"/>
+              </w:rPr>
+              <w:t>FORCE_BUILD=1</w:t>
+            </w:r>
+          </w:p>
+        </w:tc>
+        <w:tc>
+          <w:tcPr>
+            <w:tcW w:type="dxa" w:w="4320"/>
+          </w:tcPr>
+          <w:p>
+            <w:r/>
+            <w:r>
+              <w:t>rebuild the image even if it is already present</w:t>
+            </w:r>
+          </w:p>
+        </w:tc>
+      </w:tr>
+    </w:tbl>
+    <w:p/>
+    <w:p>
+      <w:r>
+        <w:t>Expect, with timings from this machine:</w:t>
+      </w:r>
+    </w:p>
+    <w:p>
+      <w:pPr>
+        <w:spacing w:after="200" w:before="120"/>
+        <w:ind w:left="432"/>
+      </w:pPr>
+      <w:r>
+        <w:rPr>
+          <w:rFonts w:ascii="Consolas" w:hAnsi="Consolas"/>
+          <w:color w:val="113355"/>
+          <w:sz w:val="18"/>
+        </w:rPr>
+        <w:t>==&gt; step 1: checking where we are and what we have</w:t>
+        <w:br/>
+        <w:t xml:space="preserve">  PASS  in the repository root</w:t>
+        <w:br/>
+        <w:t xml:space="preserve">  PASS  running from a WSL2 shell, so GUI windows will work later</w:t>
+        <w:br/>
+        <w:t xml:space="preserve">  PASS  docker is reachable  (Docker version 29.7.2, build a7dcaa6)</w:t>
+        <w:br/>
+        <w:t xml:space="preserve">  PASS  free disk: wanted 12 GB, found 112 GB</w:t>
+        <w:br/>
+        <w:br/>
+        <w:t>==&gt; step 2: submodules</w:t>
+        <w:br/>
+        <w:t xml:space="preserve">  PASS  all 9 submodules populated</w:t>
+        <w:br/>
+        <w:t xml:space="preserve">  PASS  track data and zed_description are on disk</w:t>
+        <w:br/>
+        <w:br/>
+        <w:t>==&gt; step 3: the image</w:t>
+        <w:br/>
+        <w:t xml:space="preserve">  PASS  image loaded from the tar</w:t>
+        <w:br/>
+        <w:br/>
+        <w:t>==&gt; step 4: starting the container</w:t>
+        <w:br/>
+        <w:t xml:space="preserve">  PASS  igvc_gazebo is up</w:t>
+        <w:br/>
+        <w:br/>
+        <w:t>==&gt; step 5: building the workspace</w:t>
+        <w:br/>
+        <w:t xml:space="preserve">  PASS  four packages built</w:t>
+        <w:br/>
+        <w:br/>
+        <w:t>==&gt; step 6: render_check.sh: is it on the GPU, or silently on the CPU</w:t>
+        <w:br/>
+        <w:t xml:space="preserve">        GL_RENDERER = D3D12 (NVIDIA GeForce RTX 5070 Ti Laptop GPU)</w:t>
+        <w:br/>
+        <w:t xml:space="preserve">        camera topic   : PUBLISHING</w:t>
+        <w:br/>
+        <w:t xml:space="preserve">        gpu_lidar topic: PUBLISHING</w:t>
+        <w:br/>
+        <w:t xml:space="preserve">        RESULT: HARDWARE RENDERING (NVIDIA)</w:t>
+        <w:br/>
+        <w:t xml:space="preserve">  PASS  hardware rendering, and both sensors are publishing</w:t>
+        <w:br/>
+        <w:br/>
+        <w:t>==&gt; step 7: bringup_smoke_test.sh: the topic contract, and does it drive</w:t>
+        <w:br/>
+        <w:t xml:space="preserve">        topic checks passed: 18   failed: 0</w:t>
+        <w:br/>
+        <w:t xml:space="preserve">        DRIVE TEST : PASS</w:t>
+        <w:br/>
+        <w:t xml:space="preserve">        FRAME TEST : PASS</w:t>
+        <w:br/>
+        <w:t xml:space="preserve">  PASS  the topic contract holds and the robot drives on /cmd_vel</w:t>
+        <w:br/>
+        <w:br/>
+        <w:t xml:space="preserve">  Bootstrap complete. The simulator is verified on this machine.</w:t>
+      </w:r>
+    </w:p>
+    <w:p>
+      <w:pPr>
+        <w:pStyle w:val="Heading3"/>
+      </w:pPr>
+      <w:r>
+        <w:t>If you would rather do the steps by hand</w:t>
+      </w:r>
+    </w:p>
+    <w:p>
+      <w:pPr>
+        <w:spacing w:after="200" w:before="120"/>
+        <w:ind w:left="432"/>
+      </w:pPr>
+      <w:r>
+        <w:rPr>
+          <w:rFonts w:ascii="Consolas" w:hAnsi="Consolas"/>
+          <w:color w:val="113355"/>
+          <w:sz w:val="18"/>
+        </w:rPr>
+        <w:t>git submodule update --init --recursive</w:t>
+        <w:br/>
+        <w:t>docker compose -f docker-compose.windows.yml build igvc_gazebo   # or: docker load -i &lt;tar&gt;</w:t>
+        <w:br/>
+        <w:t>docker compose -f docker-compose.windows.yml up -d igvc_gazebo</w:t>
+        <w:br/>
+        <w:t>docker exec igvc_gazebo bash -c 'source /opt/ros/jazzy/setup.bash &amp;&amp; cd /root/ros2_ws &amp;&amp;</w:t>
+        <w:br/>
+        <w:t xml:space="preserve">  colcon build --symlink-install \</w:t>
+        <w:br/>
+        <w:t xml:space="preserve">    --base-paths /root/ros2_ws/src/IGVC_robot_2026/src \</w:t>
+        <w:br/>
+        <w:t xml:space="preserve">    --packages-select zed_description igvc_test_description igvc_test_bringup igvc_lane_detection'</w:t>
+      </w:r>
+    </w:p>
+    <w:p>
+      <w:r>
+        <w:t xml:space="preserve">Note the compose file: </w:t>
+      </w:r>
+      <w:r>
+        <w:rPr>
+          <w:b/>
+        </w:rPr>
+        <w:t>`docker-compose.windows.yml`</w:t>
+      </w:r>
+      <w:r>
+        <w:t xml:space="preserve">, not the plain </w:t>
+      </w:r>
+      <w:r>
+        <w:rPr>
+          <w:rFonts w:ascii="Consolas" w:hAnsi="Consolas"/>
+          <w:sz w:val="19"/>
+        </w:rPr>
+        <w:t>docker-compose.yml</w:t>
+      </w:r>
+      <w:r>
+        <w:t>. The plain one targets native Linux and will not work here.</w:t>
+      </w:r>
+    </w:p>
+    <w:p>
+      <w:r>
+        <w:rPr>
+          <w:b/>
+        </w:rPr>
+        <w:t>Four packages, not three</w:t>
+      </w:r>
+      <w:r>
+        <w:t xml:space="preserve">, and the fourth is the one people leave out: </w:t>
+      </w:r>
+      <w:r>
+        <w:rPr>
+          <w:rFonts w:ascii="Consolas" w:hAnsi="Consolas"/>
+          <w:sz w:val="19"/>
+        </w:rPr>
+        <w:t>zed_description</w:t>
+      </w:r>
+      <w:r>
+        <w:t xml:space="preserve"> is a submodule that </w:t>
+      </w:r>
+      <w:r>
+        <w:rPr>
+          <w:rFonts w:ascii="Consolas" w:hAnsi="Consolas"/>
+          <w:sz w:val="19"/>
+        </w:rPr>
+        <w:t>igvc_test_description</w:t>
+      </w:r>
+      <w:r>
+        <w:t xml:space="preserve"> depends on, and omitting it fails the build. (The comment at the top of </w:t>
+      </w:r>
+      <w:r>
+        <w:rPr>
+          <w:rFonts w:ascii="Consolas" w:hAnsi="Consolas"/>
+          <w:sz w:val="19"/>
+        </w:rPr>
+        <w:t>start_sim.sh</w:t>
+      </w:r>
+      <w:r>
+        <w:t xml:space="preserve"> says "three"; the code selects four. The code is right.)</w:t>
+      </w:r>
+    </w:p>
+    <w:p>
+      <w:r>
+        <w:rPr>
+          <w:b/>
+        </w:rPr>
+        <w:t>Do not use `docker compose run`.</w:t>
+      </w:r>
+      <w:r>
+        <w:t xml:space="preserve"> It creates a *new* container with a random name every time, so a second </w:t>
+      </w:r>
+      <w:r>
+        <w:rPr>
+          <w:rFonts w:ascii="Consolas" w:hAnsi="Consolas"/>
+          <w:sz w:val="19"/>
+        </w:rPr>
+        <w:t>run</w:t>
+      </w:r>
+      <w:r>
+        <w:t xml:space="preserve"> gives you a second, separate simulator rather than a second shell into the first. Two simulators on one ROS domain both publish </w:t>
+      </w:r>
+      <w:r>
+        <w:rPr>
+          <w:rFonts w:ascii="Consolas" w:hAnsi="Consolas"/>
+          <w:sz w:val="19"/>
+        </w:rPr>
+        <w:t>/clock</w:t>
+      </w:r>
+      <w:r>
+        <w:t xml:space="preserve">, </w:t>
+      </w:r>
+      <w:r>
+        <w:rPr>
+          <w:rFonts w:ascii="Consolas" w:hAnsi="Consolas"/>
+          <w:sz w:val="19"/>
+        </w:rPr>
+        <w:t>/odom</w:t>
+      </w:r>
+      <w:r>
+        <w:t xml:space="preserve"> and </w:t>
+      </w:r>
+      <w:r>
+        <w:rPr>
+          <w:rFonts w:ascii="Consolas" w:hAnsi="Consolas"/>
+          <w:sz w:val="19"/>
+        </w:rPr>
+        <w:t>/tf</w:t>
+      </w:r>
+      <w:r>
+        <w:t xml:space="preserve"> for the same robot, and the navigation stack then plans against a robot whose position jumps between them. It looks exactly like a navigation bug. That is how six </w:t>
+      </w:r>
+      <w:r>
+        <w:rPr>
+          <w:rFonts w:ascii="Consolas" w:hAnsi="Consolas"/>
+          <w:sz w:val="19"/>
+        </w:rPr>
+        <w:t>gz sim</w:t>
+      </w:r>
+      <w:r>
+        <w:t xml:space="preserve"> processes once ran at once. Use </w:t>
+      </w:r>
       <w:r>
         <w:rPr>
           <w:rFonts w:ascii="Consolas" w:hAnsi="Consolas"/>
@@ -1565,68 +2767,17 @@
         <w:t>up -d</w:t>
       </w:r>
       <w:r>
-        <w:t xml:space="preserve"> starts it in the background with the fixed name </w:t>
+        <w:t xml:space="preserve"> plus </w:t>
       </w:r>
       <w:r>
         <w:rPr>
           <w:rFonts w:ascii="Consolas" w:hAnsi="Consolas"/>
           <w:sz w:val="19"/>
         </w:rPr>
-        <w:t>igvc_gazebo</w:t>
+        <w:t>docker exec</w:t>
       </w:r>
       <w:r>
         <w:t>.</w:t>
-      </w:r>
-    </w:p>
-    <w:p>
-      <w:r>
-        <w:rPr>
-          <w:b/>
-        </w:rPr>
-        <w:t>Do not use `docker compose run`.</w:t>
-      </w:r>
-      <w:r>
-        <w:t xml:space="preserve"> It creates a *new* container with a random name every time, so a second </w:t>
-      </w:r>
-      <w:r>
-        <w:rPr>
-          <w:rFonts w:ascii="Consolas" w:hAnsi="Consolas"/>
-          <w:sz w:val="19"/>
-        </w:rPr>
-        <w:t>run</w:t>
-      </w:r>
-      <w:r>
-        <w:t xml:space="preserve"> gives you a second, separate simulator rather than a second shell into the first. That has cost real debugging time: two simulators on one ROS network both publish </w:t>
-      </w:r>
-      <w:r>
-        <w:rPr>
-          <w:rFonts w:ascii="Consolas" w:hAnsi="Consolas"/>
-          <w:sz w:val="19"/>
-        </w:rPr>
-        <w:t>/clock</w:t>
-      </w:r>
-      <w:r>
-        <w:t xml:space="preserve">, </w:t>
-      </w:r>
-      <w:r>
-        <w:rPr>
-          <w:rFonts w:ascii="Consolas" w:hAnsi="Consolas"/>
-          <w:sz w:val="19"/>
-        </w:rPr>
-        <w:t>/odom</w:t>
-      </w:r>
-      <w:r>
-        <w:t xml:space="preserve"> and </w:t>
-      </w:r>
-      <w:r>
-        <w:rPr>
-          <w:rFonts w:ascii="Consolas" w:hAnsi="Consolas"/>
-          <w:sz w:val="19"/>
-        </w:rPr>
-        <w:t>/tf</w:t>
-      </w:r>
-      <w:r>
-        <w:t xml:space="preserve"> for the same robot, and the navigation stack then plans against a robot whose position jumps between the two. It looks exactly like a navigation bug.</w:t>
       </w:r>
     </w:p>
     <w:p/>
@@ -1635,7 +2786,12 @@
         <w:pStyle w:val="Heading2"/>
       </w:pPr>
       <w:r>
-        <w:t>5. Prove the GPU is actually being used - do this first, every machine</w:t>
+        <w:t>5. Making the USB drive, for whoever is handing the image out</w:t>
+      </w:r>
+    </w:p>
+    <w:p>
+      <w:r>
+        <w:t>Do this once, on a machine that already has the image:</w:t>
       </w:r>
     </w:p>
     <w:p>
@@ -1649,14 +2805,225 @@
           <w:color w:val="113355"/>
           <w:sz w:val="18"/>
         </w:rPr>
-        <w:t>docker exec -it igvc_gazebo bash -c \</w:t>
-        <w:br/>
-        <w:t xml:space="preserve">  "source /opt/ros/jazzy/setup.bash &amp;&amp; bash src/IGVC_robot_2026/scripts/gazebo/render_check.sh"</w:t>
+        <w:t>docker save igvc-gazebo-jazzy:latest -o igvc-gazebo-jazzy.tar</w:t>
+      </w:r>
+    </w:p>
+    <w:tbl>
+      <w:tblPr>
+        <w:tblStyle w:val="LightGrid-Accent1"/>
+        <w:tblW w:type="auto" w:w="0"/>
+        <w:tblLook w:firstColumn="1" w:firstRow="1" w:lastColumn="0" w:lastRow="0" w:noHBand="0" w:noVBand="1" w:val="04A0"/>
+      </w:tblPr>
+      <w:tblGrid>
+        <w:gridCol w:w="4320"/>
+        <w:gridCol w:w="4320"/>
+      </w:tblGrid>
+      <w:tr>
+        <w:tc>
+          <w:tcPr>
+            <w:tcW w:type="dxa" w:w="4320"/>
+          </w:tcPr>
+          <w:p>
+            <w:r>
+              <w:rPr>
+                <w:b/>
+              </w:rPr>
+            </w:r>
+            <w:r>
+              <w:rPr>
+                <w:b/>
+              </w:rPr>
+              <w:t>Measured on this machine</w:t>
+            </w:r>
+          </w:p>
+        </w:tc>
+        <w:tc>
+          <w:tcPr>
+            <w:tcW w:type="dxa" w:w="4320"/>
+          </w:tcPr>
+          <w:p>
+            <w:r>
+              <w:rPr>
+                <w:b/>
+              </w:rPr>
+            </w:r>
+          </w:p>
+        </w:tc>
+      </w:tr>
+      <w:tr>
+        <w:tc>
+          <w:tcPr>
+            <w:tcW w:type="dxa" w:w="4320"/>
+          </w:tcPr>
+          <w:p>
+            <w:r/>
+            <w:r>
+              <w:rPr>
+                <w:rFonts w:ascii="Consolas" w:hAnsi="Consolas"/>
+                <w:sz w:val="19"/>
+              </w:rPr>
+              <w:t>docker save</w:t>
+            </w:r>
+            <w:r>
+              <w:t xml:space="preserve"> wall time</w:t>
+            </w:r>
+          </w:p>
+        </w:tc>
+        <w:tc>
+          <w:tcPr>
+            <w:tcW w:type="dxa" w:w="4320"/>
+          </w:tcPr>
+          <w:p>
+            <w:r/>
+            <w:r>
+              <w:rPr>
+                <w:b/>
+              </w:rPr>
+              <w:t>14.6 s</w:t>
+            </w:r>
+          </w:p>
+        </w:tc>
+      </w:tr>
+      <w:tr>
+        <w:tc>
+          <w:tcPr>
+            <w:tcW w:type="dxa" w:w="4320"/>
+          </w:tcPr>
+          <w:p>
+            <w:r/>
+            <w:r>
+              <w:t>resulting file</w:t>
+            </w:r>
+          </w:p>
+        </w:tc>
+        <w:tc>
+          <w:tcPr>
+            <w:tcW w:type="dxa" w:w="4320"/>
+          </w:tcPr>
+          <w:p>
+            <w:r/>
+            <w:r>
+              <w:rPr>
+                <w:b/>
+              </w:rPr>
+              <w:t>1,201,505,280 bytes, 1.20 GB</w:t>
+            </w:r>
+          </w:p>
+        </w:tc>
+      </w:tr>
+      <w:tr>
+        <w:tc>
+          <w:tcPr>
+            <w:tcW w:type="dxa" w:w="4320"/>
+          </w:tcPr>
+          <w:p>
+            <w:r/>
+            <w:r>
+              <w:t>the image unpacked</w:t>
+            </w:r>
+          </w:p>
+        </w:tc>
+        <w:tc>
+          <w:tcPr>
+            <w:tcW w:type="dxa" w:w="4320"/>
+          </w:tcPr>
+          <w:p>
+            <w:r/>
+            <w:r>
+              <w:t>5.57 GB</w:t>
+            </w:r>
+          </w:p>
+        </w:tc>
+      </w:tr>
+    </w:tbl>
+    <w:p/>
+    <w:p>
+      <w:r>
+        <w:t xml:space="preserve">The tar is much smaller than the image because it holds the </w:t>
+      </w:r>
+      <w:r>
+        <w:rPr>
+          <w:b/>
+        </w:rPr>
+        <w:t>compressed</w:t>
+      </w:r>
+      <w:r>
+        <w:t xml:space="preserve"> layer blobs, which the daemon unpacks on load. A complete tar is an OCI layout: a </w:t>
+      </w:r>
+      <w:r>
+        <w:rPr>
+          <w:rFonts w:ascii="Consolas" w:hAnsi="Consolas"/>
+          <w:sz w:val="19"/>
+        </w:rPr>
+        <w:t>blobs/sha256/</w:t>
+      </w:r>
+      <w:r>
+        <w:t xml:space="preserve"> directory, </w:t>
+      </w:r>
+      <w:r>
+        <w:rPr>
+          <w:rFonts w:ascii="Consolas" w:hAnsi="Consolas"/>
+          <w:sz w:val="19"/>
+        </w:rPr>
+        <w:t>index.json</w:t>
+      </w:r>
+      <w:r>
+        <w:t xml:space="preserve">, </w:t>
+      </w:r>
+      <w:r>
+        <w:rPr>
+          <w:rFonts w:ascii="Consolas" w:hAnsi="Consolas"/>
+          <w:sz w:val="19"/>
+        </w:rPr>
+        <w:t>manifest.json</w:t>
+      </w:r>
+      <w:r>
+        <w:t xml:space="preserve"> and </w:t>
+      </w:r>
+      <w:r>
+        <w:rPr>
+          <w:rFonts w:ascii="Consolas" w:hAnsi="Consolas"/>
+          <w:sz w:val="19"/>
+        </w:rPr>
+        <w:t>oci-layout</w:t>
+      </w:r>
+      <w:r>
+        <w:t xml:space="preserve">. You can check yours is not truncated with </w:t>
+      </w:r>
+      <w:r>
+        <w:rPr>
+          <w:rFonts w:ascii="Consolas" w:hAnsi="Consolas"/>
+          <w:sz w:val="19"/>
+        </w:rPr>
+        <w:t>tar -tf igvc-gazebo-jazzy.tar | tail -4</w:t>
+      </w:r>
+      <w:r>
+        <w:t>.</w:t>
       </w:r>
     </w:p>
     <w:p>
       <w:r>
-        <w:t>Want:</w:t>
+        <w:t xml:space="preserve">Copy that one file to the drive. On the receiving machine, either pass </w:t>
+      </w:r>
+      <w:r>
+        <w:rPr>
+          <w:rFonts w:ascii="Consolas" w:hAnsi="Consolas"/>
+          <w:sz w:val="19"/>
+        </w:rPr>
+        <w:t>IMAGE_TAR</w:t>
+      </w:r>
+      <w:r>
+        <w:t xml:space="preserve"> to </w:t>
+      </w:r>
+      <w:r>
+        <w:rPr>
+          <w:rFonts w:ascii="Consolas" w:hAnsi="Consolas"/>
+          <w:sz w:val="19"/>
+        </w:rPr>
+        <w:t>bootstrap.sh</w:t>
+      </w:r>
+      <w:r>
+        <w:t xml:space="preserve"> as in section 4, or load it by hand:</w:t>
       </w:r>
     </w:p>
     <w:p>
@@ -1670,46 +3037,33 @@
           <w:color w:val="113355"/>
           <w:sz w:val="18"/>
         </w:rPr>
-        <w:t>RESULT: HARDWARE RENDERING (NVIDIA)</w:t>
+        <w:t>docker load -i /mnt/d/igvc-gazebo-jazzy.tar</w:t>
       </w:r>
     </w:p>
     <w:p>
       <w:r>
-        <w:t xml:space="preserve">If you get </w:t>
+        <w:t xml:space="preserve">Expect </w:t>
       </w:r>
       <w:r>
         <w:rPr>
           <w:rFonts w:ascii="Consolas" w:hAnsi="Consolas"/>
           <w:sz w:val="19"/>
         </w:rPr>
-        <w:t>SOFTWARE FALLBACK (llvmpipe)</w:t>
-      </w:r>
-      <w:r>
-        <w:t xml:space="preserve">, Gazebo is rendering on the CPU. It will still run, slowly, and </w:t>
-      </w:r>
+        <w:t>Loaded image: igvc-gazebo-jazzy:latest</w:t>
+      </w:r>
+      <w:r>
+        <w:t>.</w:t>
+      </w:r>
+    </w:p>
+    <w:p>
       <w:r>
         <w:rPr>
           <w:b/>
         </w:rPr>
-        <w:t>every camera measurement you take will be meaningless</w:t>
-      </w:r>
-      <w:r>
-        <w:t>. This failure is silent - nothing errors, it is just 20x slower - which is exactly why this check exists and why it goes first.</w:t>
-      </w:r>
-    </w:p>
-    <w:p>
-      <w:r>
-        <w:t xml:space="preserve">Do not use </w:t>
-      </w:r>
-      <w:r>
-        <w:rPr>
-          <w:rFonts w:ascii="Consolas" w:hAnsi="Consolas"/>
-          <w:sz w:val="19"/>
-        </w:rPr>
-        <w:t>nvidia-smi</w:t>
-      </w:r>
-      <w:r>
-        <w:t xml:space="preserve"> for this. It reports CUDA working fine while OpenGL is on a software rasteriser.</w:t>
+        <w:t>An exFAT drive is required if the image ever grows past 4 GB</w:t>
+      </w:r>
+      <w:r>
+        <w:t>, because FAT32 cannot hold a single file that large. 1.20 GB is fine on either, but do not assume it stays that way.</w:t>
       </w:r>
     </w:p>
     <w:p/>
@@ -1786,7 +3140,16 @@
         <w:t>/root/ros2_ws/src/IGVC_robot_2026</w:t>
       </w:r>
       <w:r>
-        <w:t xml:space="preserve">. The directory keeps the 2026 name on purpose: the compose files, </w:t>
+        <w:t xml:space="preserve">. That directory keeps the </w:t>
+      </w:r>
+      <w:r>
+        <w:rPr>
+          <w:b/>
+        </w:rPr>
+        <w:t>2026</w:t>
+      </w:r>
+      <w:r>
+        <w:t xml:space="preserve"> name on purpose: the compose files, </w:t>
       </w:r>
       <w:r>
         <w:rPr>
@@ -1933,6 +3296,34 @@
                 <w:rFonts w:ascii="Consolas" w:hAnsi="Consolas"/>
                 <w:sz w:val="19"/>
               </w:rPr>
+              <w:t>CAMERAS=all</w:t>
+            </w:r>
+          </w:p>
+        </w:tc>
+        <w:tc>
+          <w:tcPr>
+            <w:tcW w:type="dxa" w:w="4320"/>
+          </w:tcPr>
+          <w:p>
+            <w:r/>
+            <w:r>
+              <w:t>all three ZED cameras instead of just the front one</w:t>
+            </w:r>
+          </w:p>
+        </w:tc>
+      </w:tr>
+      <w:tr>
+        <w:tc>
+          <w:tcPr>
+            <w:tcW w:type="dxa" w:w="4320"/>
+          </w:tcPr>
+          <w:p>
+            <w:r/>
+            <w:r>
+              <w:rPr>
+                <w:rFonts w:ascii="Consolas" w:hAnsi="Consolas"/>
+                <w:sz w:val="19"/>
+              </w:rPr>
               <w:t>RVIZ=0</w:t>
             </w:r>
           </w:p>
@@ -1977,39 +3368,11 @@
           </w:p>
         </w:tc>
       </w:tr>
-      <w:tr>
-        <w:tc>
-          <w:tcPr>
-            <w:tcW w:type="dxa" w:w="4320"/>
-          </w:tcPr>
-          <w:p>
-            <w:r/>
-            <w:r>
-              <w:rPr>
-                <w:rFonts w:ascii="Consolas" w:hAnsi="Consolas"/>
-                <w:sz w:val="19"/>
-              </w:rPr>
-              <w:t>CAMERAS=all</w:t>
-            </w:r>
-          </w:p>
-        </w:tc>
-        <w:tc>
-          <w:tcPr>
-            <w:tcW w:type="dxa" w:w="4320"/>
-          </w:tcPr>
-          <w:p>
-            <w:r/>
-            <w:r>
-              <w:t>all three ZED cameras instead of just the front one</w:t>
-            </w:r>
-          </w:p>
-        </w:tc>
-      </w:tr>
     </w:tbl>
     <w:p/>
     <w:p>
       <w:r>
-        <w:t>So the demo - the robot driving the course by itself:</w:t>
+        <w:t>So the demo, the robot driving the course by itself:</w:t>
       </w:r>
     </w:p>
     <w:p>
@@ -2028,7 +3391,7 @@
     </w:p>
     <w:p>
       <w:r>
-        <w:t>Give it about 60 seconds. Gazebo loads, then Nav2 starts 15 seconds later on purpose (see section 9), then the navigator plans and the robot sets off.</w:t>
+        <w:t>Give it about 60 seconds. Gazebo loads, then Nav2 starts 15 seconds later on purpose (section 9), then the navigator plans and the robot sets off.</w:t>
       </w:r>
     </w:p>
     <w:p>
@@ -2037,6 +3400,108 @@
           <w:b/>
         </w:rPr>
         <w:t>Ctrl-C in that shell stops everything.</w:t>
+      </w:r>
+    </w:p>
+    <w:p>
+      <w:r>
+        <w:t xml:space="preserve">Camera resolution defaults to 640x360 at 15 Hz. Both launch files now accept </w:t>
+      </w:r>
+      <w:r>
+        <w:rPr>
+          <w:rFonts w:ascii="Consolas" w:hAnsi="Consolas"/>
+          <w:sz w:val="19"/>
+        </w:rPr>
+        <w:t>sim_camera_width</w:t>
+      </w:r>
+      <w:r>
+        <w:t xml:space="preserve">, </w:t>
+      </w:r>
+      <w:r>
+        <w:rPr>
+          <w:rFonts w:ascii="Consolas" w:hAnsi="Consolas"/>
+          <w:sz w:val="19"/>
+        </w:rPr>
+        <w:t>sim_camera_height</w:t>
+      </w:r>
+      <w:r>
+        <w:t xml:space="preserve"> and </w:t>
+      </w:r>
+      <w:r>
+        <w:rPr>
+          <w:rFonts w:ascii="Consolas" w:hAnsi="Consolas"/>
+          <w:sz w:val="19"/>
+        </w:rPr>
+        <w:t>sim_camera_hz</w:t>
+      </w:r>
+      <w:r>
+        <w:t xml:space="preserve"> if you need to change it, including on the autonomy path, where until 2026-09-17 they were silently unreachable:</w:t>
+      </w:r>
+    </w:p>
+    <w:p>
+      <w:pPr>
+        <w:spacing w:after="200" w:before="120"/>
+        <w:ind w:left="432"/>
+      </w:pPr>
+      <w:r>
+        <w:rPr>
+          <w:rFonts w:ascii="Consolas" w:hAnsi="Consolas"/>
+          <w:color w:val="113355"/>
+          <w:sz w:val="18"/>
+        </w:rPr>
+        <w:t>ros2 launch igvc_test_bringup gazebo_nav_test.launch.py \</w:t>
+        <w:br/>
+        <w:t xml:space="preserve">    sim_camera_width:=1280 sim_camera_height:=720</w:t>
+      </w:r>
+    </w:p>
+    <w:p>
+      <w:r>
+        <w:rPr>
+          <w:rFonts w:ascii="Consolas" w:hAnsi="Consolas"/>
+          <w:sz w:val="19"/>
+        </w:rPr>
+        <w:t>sim_cameras</w:t>
+      </w:r>
+      <w:r>
+        <w:t xml:space="preserve"> accepts exactly </w:t>
+      </w:r>
+      <w:r>
+        <w:rPr>
+          <w:rFonts w:ascii="Consolas" w:hAnsi="Consolas"/>
+          <w:sz w:val="19"/>
+        </w:rPr>
+        <w:t>none</w:t>
+      </w:r>
+      <w:r>
+        <w:t xml:space="preserve">, </w:t>
+      </w:r>
+      <w:r>
+        <w:rPr>
+          <w:rFonts w:ascii="Consolas" w:hAnsi="Consolas"/>
+          <w:sz w:val="19"/>
+        </w:rPr>
+        <w:t>front</w:t>
+      </w:r>
+      <w:r>
+        <w:t xml:space="preserve"> or </w:t>
+      </w:r>
+      <w:r>
+        <w:rPr>
+          <w:rFonts w:ascii="Consolas" w:hAnsi="Consolas"/>
+          <w:sz w:val="19"/>
+        </w:rPr>
+        <w:t>all</w:t>
+      </w:r>
+      <w:r>
+        <w:t xml:space="preserve">. Anything else is now rejected with a readable error. It used to silently build a robot with </w:t>
+      </w:r>
+      <w:r>
+        <w:rPr>
+          <w:b/>
+        </w:rPr>
+        <w:t>zero cameras</w:t>
+      </w:r>
+      <w:r>
+        <w:t xml:space="preserve"> that launched cleanly.</w:t>
       </w:r>
     </w:p>
     <w:p/>
@@ -2165,7 +3630,16 @@
     </w:p>
     <w:p>
       <w:r>
-        <w:t xml:space="preserve">Gazebo's DiffDrive holds the last command it was given, so if you drive forward and let go of the key, the robot keeps going. Press </w:t>
+        <w:t xml:space="preserve">Gazebo's DiffDrive </w:t>
+      </w:r>
+      <w:r>
+        <w:rPr>
+          <w:b/>
+        </w:rPr>
+        <w:t>holds the last command it was given</w:t>
+      </w:r>
+      <w:r>
+        <w:t xml:space="preserve">, so if you drive forward and let go of the key, the robot keeps going. Press </w:t>
       </w:r>
       <w:r>
         <w:rPr>
@@ -2175,7 +3649,26 @@
         <w:t>k</w:t>
       </w:r>
       <w:r>
-        <w:t>.</w:t>
+        <w:t xml:space="preserve">. Measured today: it travelled a further </w:t>
+      </w:r>
+      <w:r>
+        <w:rPr>
+          <w:b/>
+        </w:rPr>
+        <w:t>3.672 m in the 4 s after `/cmd_vel` stopped</w:t>
+      </w:r>
+      <w:r>
+        <w:t xml:space="preserve">. Whether that is a true absence of timeout or a long one is still an open question, and </w:t>
+      </w:r>
+      <w:r>
+        <w:rPr>
+          <w:rFonts w:ascii="Consolas" w:hAnsi="Consolas"/>
+          <w:sz w:val="19"/>
+        </w:rPr>
+        <w:t>diff_drive_controller</w:t>
+      </w:r>
+      <w:r>
+        <w:t xml:space="preserve"> on the real robot does time out, so the simulator is the less safe of the two.</w:t>
       </w:r>
     </w:p>
     <w:p/>
@@ -2189,7 +3682,17 @@
     </w:p>
     <w:p>
       <w:r>
-        <w:t>Two scripts. Both run inside the container and both are built to fail when something is wrong, rather than to look reassuring.</w:t>
+        <w:t xml:space="preserve">Both run inside the container and both are built to fail when something is wrong rather than to look reassuring. </w:t>
+      </w:r>
+      <w:r>
+        <w:rPr>
+          <w:rFonts w:ascii="Consolas" w:hAnsi="Consolas"/>
+          <w:sz w:val="19"/>
+        </w:rPr>
+        <w:t>bootstrap.sh</w:t>
+      </w:r>
+      <w:r>
+        <w:t xml:space="preserve"> runs the first two for you; these are the commands to re-run one on its own.</w:t>
       </w:r>
     </w:p>
     <w:p>
@@ -2203,46 +3706,85 @@
           <w:color w:val="113355"/>
           <w:sz w:val="18"/>
         </w:rPr>
-        <w:t># the simulator and the topic contract: ~4 minutes</w:t>
-        <w:br/>
         <w:t>docker exec -it igvc_gazebo bash -c \</w:t>
         <w:br/>
-        <w:t xml:space="preserve">  "source /opt/ros/jazzy/setup.bash &amp;&amp; bash src/IGVC_robot_2026/scripts/gazebo/bringup_smoke_test.sh"</w:t>
+        <w:t xml:space="preserve">  "bash src/IGVC_robot_2026/scripts/gazebo/render_check.sh"</w:t>
       </w:r>
     </w:p>
     <w:p>
       <w:r>
-        <w:t xml:space="preserve">Expect </w:t>
+        <w:t xml:space="preserve">Want </w:t>
       </w:r>
       <w:r>
         <w:rPr>
           <w:rFonts w:ascii="Consolas" w:hAnsi="Consolas"/>
           <w:sz w:val="19"/>
         </w:rPr>
-        <w:t>topic checks passed: 18   failed: 0</w:t>
-      </w:r>
-      <w:r>
-        <w:t xml:space="preserve">, plus </w:t>
+        <w:t>RESULT: HARDWARE RENDERING (NVIDIA)</w:t>
+      </w:r>
+      <w:r>
+        <w:t>.</w:t>
+      </w:r>
+    </w:p>
+    <w:p>
+      <w:r>
+        <w:rPr>
+          <w:b/>
+        </w:rPr>
+        <w:t>You no longer need to source ROS before this.</w:t>
+      </w:r>
+      <w:r>
+        <w:t xml:space="preserve"> Earlier versions of this guide told you to, and until 2026-09-17 you genuinely had to, because </w:t>
       </w:r>
       <w:r>
         <w:rPr>
           <w:rFonts w:ascii="Consolas" w:hAnsi="Consolas"/>
           <w:sz w:val="19"/>
         </w:rPr>
-        <w:t>DRIVE TEST: PASS</w:t>
-      </w:r>
-      <w:r>
-        <w:t xml:space="preserve"> and </w:t>
+        <w:t>gz</w:t>
+      </w:r>
+      <w:r>
+        <w:t xml:space="preserve"> on this image comes from the ROS *vendor* packages and </w:t>
       </w:r>
       <w:r>
         <w:rPr>
           <w:rFonts w:ascii="Consolas" w:hAnsi="Consolas"/>
           <w:sz w:val="19"/>
         </w:rPr>
-        <w:t>FRAME TEST: PASS</w:t>
-      </w:r>
-      <w:r>
-        <w:t>. It commands a velocity and checks the odometry moved by roughly the right amount in roughly the right direction, compared against Gazebo's own ground truth - because "the topics exist" passes on a badly broken setup.</w:t>
+        <w:t>/root/.bashrc</w:t>
+      </w:r>
+      <w:r>
+        <w:t xml:space="preserve"> does not source </w:t>
+      </w:r>
+      <w:r>
+        <w:rPr>
+          <w:rFonts w:ascii="Consolas" w:hAnsi="Consolas"/>
+          <w:sz w:val="19"/>
+        </w:rPr>
+        <w:t>setup.bash</w:t>
+      </w:r>
+      <w:r>
+        <w:t xml:space="preserve">. The script failed on a clean container with </w:t>
+      </w:r>
+      <w:r>
+        <w:rPr>
+          <w:rFonts w:ascii="Consolas" w:hAnsi="Consolas"/>
+          <w:sz w:val="19"/>
+        </w:rPr>
+        <w:t>gz: No such file or directory</w:t>
+      </w:r>
+      <w:r>
+        <w:t xml:space="preserve"> and printed </w:t>
+      </w:r>
+      <w:r>
+        <w:rPr>
+          <w:rFonts w:ascii="Consolas" w:hAnsi="Consolas"/>
+          <w:sz w:val="19"/>
+        </w:rPr>
+        <w:t>RESULT: UNKNOWN</w:t>
+      </w:r>
+      <w:r>
+        <w:t>, which reads as a broken GPU rather than a missing PATH entry. It sources ROS itself now.</w:t>
       </w:r>
     </w:p>
     <w:p>
@@ -2256,35 +3798,16 @@
           <w:color w:val="113355"/>
           <w:sz w:val="18"/>
         </w:rPr>
-        <w:t># does the robot drive the course by itself: ~5 minutes</w:t>
+        <w:t># the simulator and the topic contract: about 4 minutes</w:t>
         <w:br/>
         <w:t>docker exec -it igvc_gazebo bash -c \</w:t>
         <w:br/>
-        <w:t xml:space="preserve">  "source /opt/ros/jazzy/setup.bash &amp;&amp; bash src/IGVC_robot_2026/scripts/gazebo/autonomy_check.sh"</w:t>
+        <w:t xml:space="preserve">  "bash src/IGVC_robot_2026/scripts/gazebo/bringup_smoke_test.sh"</w:t>
       </w:r>
     </w:p>
     <w:p>
       <w:r>
-        <w:t xml:space="preserve">Expect </w:t>
-      </w:r>
-      <w:r>
-        <w:rPr>
-          <w:rFonts w:ascii="Consolas" w:hAnsi="Consolas"/>
-          <w:sz w:val="19"/>
-        </w:rPr>
-        <w:t>AUTONOMY CHECK: PASS</w:t>
-      </w:r>
-      <w:r>
-        <w:t xml:space="preserve">. This script </w:t>
-      </w:r>
-      <w:r>
-        <w:rPr>
-          <w:b/>
-        </w:rPr>
-        <w:t>never publishes a velocity command</w:t>
-      </w:r>
-      <w:r>
-        <w:t xml:space="preserve"> - every command the robot receives comes from Nav2. Reference numbers from 2026-09-15:</w:t>
+        <w:t>Measured on this machine today:</w:t>
       </w:r>
     </w:p>
     <w:p>
@@ -2298,11 +3821,109 @@
           <w:color w:val="113355"/>
           <w:sz w:val="18"/>
         </w:rPr>
-        <w:t>distance travelled   122.9 m</w:t>
+        <w:t>topic checks passed: 18   failed: 0</w:t>
         <w:br/>
-        <w:t>centreline deviation mean 0.72 m, max 1.79 m</w:t>
+        <w:t>odometry displacement : 7.073 m</w:t>
+        <w:br/>
+        <w:t>simulator ground truth: 7.081 m</w:t>
+        <w:br/>
+        <w:t>heading disagreement  : 0.13 deg     (a wrong odom frame shows up here)</w:t>
+        <w:br/>
+        <w:t>distance ratio        : 0.9988       (a wrong wheel radius shows up here)</w:t>
+        <w:br/>
+        <w:t>DRIVE TEST : PASS</w:t>
+        <w:br/>
+        <w:t>FRAME TEST : PASS</w:t>
+      </w:r>
+    </w:p>
+    <w:p>
+      <w:r>
+        <w:t>It commands a velocity and checks the odometry moved by roughly the right amount in roughly the right direction, compared against Gazebo's own ground truth, because "the topics exist" passes on a badly broken setup.</w:t>
+      </w:r>
+    </w:p>
+    <w:p>
+      <w:pPr>
+        <w:spacing w:after="200" w:before="120"/>
+        <w:ind w:left="432"/>
+      </w:pPr>
+      <w:r>
+        <w:rPr>
+          <w:rFonts w:ascii="Consolas" w:hAnsi="Consolas"/>
+          <w:color w:val="113355"/>
+          <w:sz w:val="18"/>
+        </w:rPr>
+        <w:t># does the robot drive the course by itself: about 5 minutes</w:t>
+        <w:br/>
+        <w:t>docker exec -it igvc_gazebo bash -c \</w:t>
+        <w:br/>
+        <w:t xml:space="preserve">  "bash src/IGVC_robot_2026/scripts/gazebo/autonomy_check.sh"</w:t>
+      </w:r>
+    </w:p>
+    <w:p>
+      <w:r>
+        <w:t xml:space="preserve">This script </w:t>
+      </w:r>
+      <w:r>
+        <w:rPr>
+          <w:b/>
+        </w:rPr>
+        <w:t>never publishes a velocity command</w:t>
+      </w:r>
+      <w:r>
+        <w:t>: every command the robot receives comes from Nav2. Measured today:</w:t>
+      </w:r>
+    </w:p>
+    <w:p>
+      <w:pPr>
+        <w:spacing w:after="200" w:before="120"/>
+        <w:ind w:left="432"/>
+      </w:pPr>
+      <w:r>
+        <w:rPr>
+          <w:rFonts w:ascii="Consolas" w:hAnsi="Consolas"/>
+          <w:color w:val="113355"/>
+          <w:sz w:val="18"/>
+        </w:rPr>
+        <w:t>samples              : 893  at 9.5 Hz</w:t>
+        <w:br/>
+        <w:t>distance travelled   : 83.0 m</w:t>
+        <w:br/>
+        <w:t>furthest two points  : 29.3 m apart</w:t>
+        <w:br/>
+        <w:t>centreline deviation : mean 0.67 m, max 1.86 m</w:t>
+        <w:br/>
+        <w:t>yaw to lane          : mean 15.9 deg, max 48.0 deg</w:t>
+        <w:br/>
+        <w:t>lane clearance       : worst +0.040 m (chassis), +0.081 m (Nav2 footprint)</w:t>
+        <w:br/>
+        <w:t xml:space="preserve">                       0.0% of samples over the line</w:t>
+        <w:br/>
+        <w:br/>
+        <w:t>MOVED       : PASS      PROGRESS    : PASS</w:t>
+        <w:br/>
+        <w:t>IN LANE     : PASS      ON THE SLAB : PASS</w:t>
         <w:br/>
         <w:t>AUTONOMY CHECK: PASS</w:t>
+      </w:r>
+    </w:p>
+    <w:p>
+      <w:r>
+        <w:rPr>
+          <w:b/>
+        </w:rPr>
+        <w:t>Read `IN LANE` with care. It is currently a coin flip and that is a known defect in the test, not in the robot.</w:t>
+      </w:r>
+      <w:r>
+        <w:t xml:space="preserve"> It compares centreline deviation against a flat 2.00 m tolerance, but the lane width varies by a factor of two along the course, so the threshold is measuring the wrong quantity and the runs sit right on it: three runs at honest sampling produced 2.04 (FAIL), 1.95 (PASS) and 1.98 (PASS). In every one of those runs the robot drove 47 to 51 m under its own control, stayed on the slab, and put </w:t>
+      </w:r>
+      <w:r>
+        <w:rPr>
+          <w:b/>
+        </w:rPr>
+        <w:t>0.0%</w:t>
+      </w:r>
+      <w:r>
+        <w:t xml:space="preserve"> of samples over the paint. If you get a FAIL here, look at the clearance line before believing the robot misbehaved. A team decision is pending and nobody should raise the tolerance to make it green.</w:t>
       </w:r>
     </w:p>
     <w:p>
@@ -2378,7 +3999,47 @@
         <w:t>MESA_D3D12_DEFAULT_ADAPTER_NAME=NVIDIA</w:t>
       </w:r>
       <w:r>
-        <w:t xml:space="preserve"> in the compose file is what stops Mesa picking the Intel one and crashing.</w:t>
+        <w:t xml:space="preserve"> in the compose file is what stops Mesa picking the Intel one and crashing. Do </w:t>
+      </w:r>
+      <w:r>
+        <w:rPr>
+          <w:b/>
+        </w:rPr>
+        <w:t>not</w:t>
+      </w:r>
+      <w:r>
+        <w:t xml:space="preserve"> use </w:t>
+      </w:r>
+      <w:r>
+        <w:rPr>
+          <w:rFonts w:ascii="Consolas" w:hAnsi="Consolas"/>
+          <w:sz w:val="19"/>
+        </w:rPr>
+        <w:t>nvidia-smi</w:t>
+      </w:r>
+      <w:r>
+        <w:t xml:space="preserve"> to check this: it reports CUDA working fine while OpenGL is on a software rasteriser.</w:t>
+      </w:r>
+    </w:p>
+    <w:p>
+      <w:r>
+        <w:rPr>
+          <w:b/>
+        </w:rPr>
+        <w:t>`colcon build` fails with a package it cannot find, usually `zed_description`.</w:t>
+      </w:r>
+      <w:r>
+        <w:t xml:space="preserve"> Your submodules are empty. </w:t>
+      </w:r>
+      <w:r>
+        <w:rPr>
+          <w:rFonts w:ascii="Consolas" w:hAnsi="Consolas"/>
+          <w:sz w:val="19"/>
+        </w:rPr>
+        <w:t>git submodule update --init --recursive</w:t>
+      </w:r>
+      <w:r>
+        <w:t>. See section 2.</w:t>
       </w:r>
     </w:p>
     <w:p>
@@ -2389,7 +4050,7 @@
         <w:t>"A simulator is ALREADY RUNNING in this container."</w:t>
       </w:r>
       <w:r>
-        <w:t xml:space="preserve"> Exactly what it says, and the scripts now refuse rather than add a second one. Either let the test clean up (it does, automatically) or reset:</w:t>
+        <w:t xml:space="preserve"> Exactly what it says, and the scripts refuse rather than add a second one. Either let the test clean up, which it does automatically, or reset:</w:t>
       </w:r>
     </w:p>
     <w:p>
@@ -2414,7 +4075,7 @@
         <w:t>The robot does not move with `NAV=1`.</w:t>
       </w:r>
       <w:r>
-        <w:t xml:space="preserve"> Give it 60 seconds; Nav2 brings up ten nodes in sequence. If it still does not, look for </w:t>
+        <w:t xml:space="preserve"> Give it 60 seconds; Nav2 brings up ten lifecycle nodes in sequence. If it still does not, look for </w:t>
       </w:r>
       <w:r>
         <w:rPr>
@@ -2424,7 +4085,7 @@
         <w:t>Failed to bring up all requested nodes</w:t>
       </w:r>
       <w:r>
-        <w:t xml:space="preserve"> in the output - that is Nav2's lifecycle bringup losing a race against Gazebo's startup on a loaded machine. Raise the delay:</w:t>
+        <w:t xml:space="preserve"> in the output. That is Nav2's lifecycle bringup losing a race against Gazebo's startup on a loaded machine. Raise the delay:</w:t>
       </w:r>
     </w:p>
     <w:p>
@@ -2459,7 +4120,7 @@
         <w:t>docker exec igvc_gazebo ps -ef | grep gz</w:t>
       </w:r>
       <w:r>
-        <w:t xml:space="preserve">), and try </w:t>
+        <w:t xml:space="preserve">), and use </w:t>
       </w:r>
       <w:r>
         <w:rPr>
@@ -2469,7 +4130,17 @@
         <w:t>CAMERAS=front</w:t>
       </w:r>
       <w:r>
-        <w:t>, the default. Three 720p cameras drop the simulator to about 7 Hz each.</w:t>
+        <w:t xml:space="preserve">, the default. Three 720p cameras drop the simulator to about 7 Hz each. Note that </w:t>
+      </w:r>
+      <w:r>
+        <w:rPr>
+          <w:rFonts w:ascii="Consolas" w:hAnsi="Consolas"/>
+          <w:sz w:val="19"/>
+        </w:rPr>
+        <w:t>real_time_factor</w:t>
+      </w:r>
+      <w:r>
+        <w:t xml:space="preserve"> will read near 1.0 anyway, because gz-sim runs physics and rendering on separate threads. Count messages, never trust RTF.</w:t>
       </w:r>
     </w:p>
     <w:p>
@@ -2480,7 +4151,7 @@
         <w:t>The build fails partway.</w:t>
       </w:r>
       <w:r>
-        <w:t xml:space="preserve"> Re-run it first - partial layers are cached and a network hiccup mid-download is the common cause. If it fails in the same place twice, check free disk (</w:t>
+        <w:t xml:space="preserve"> Re-run it first: partial layers are cached and a network hiccup mid-download is the common cause. If it fails in the same place twice, check free disk (</w:t>
       </w:r>
       <w:r>
         <w:rPr>
@@ -2490,7 +4161,7 @@
         <w:t>df -h</w:t>
       </w:r>
       <w:r>
-        <w:t xml:space="preserve"> in the WSL2 shell) and Docker Desktop's disk limit. Behind a corporate proxy or VPN, Docker needs the proxy configured in Settings -&gt; Resources -&gt; Proxies, or </w:t>
+        <w:t xml:space="preserve"> in the WSL2 shell) and Docker Desktop's disk limit. Behind a corporate proxy or VPN, Docker needs the proxy configured in Settings, Resources, Proxies, or </w:t>
       </w:r>
       <w:r>
         <w:rPr>
@@ -2551,7 +4222,7 @@
         <w:t>*.sh</w:t>
       </w:r>
       <w:r>
-        <w:t>, so this means the checkout predates that or Git was configured to override it. Fix the checkout rather than adding workarounds:</w:t>
+        <w:t>, so a normal clone is fine; this means Git was configured to override it. Fix the checkout rather than adding workarounds:</w:t>
       </w:r>
     </w:p>
     <w:p>
@@ -2659,10 +4330,20 @@
           <w:rFonts w:ascii="Consolas" w:hAnsi="Consolas"/>
           <w:sz w:val="19"/>
         </w:rPr>
+        <w:t>bootstrap.sh</w:t>
+      </w:r>
+      <w:r>
+        <w:t xml:space="preserve"> and </w:t>
+      </w:r>
+      <w:r>
+        <w:rPr>
+          <w:rFonts w:ascii="Consolas" w:hAnsi="Consolas"/>
+          <w:sz w:val="19"/>
+        </w:rPr>
         <w:t>start_sim.sh</w:t>
       </w:r>
       <w:r>
-        <w:t xml:space="preserve"> builds it for you; if you launched </w:t>
+        <w:t xml:space="preserve"> both build it for you; if you launched </w:t>
       </w:r>
       <w:r>
         <w:rPr>
@@ -2672,17 +4353,7 @@
         <w:t>ros2 launch</w:t>
       </w:r>
       <w:r>
-        <w:t xml:space="preserve"> by hand, run the colcon build in section 8 of </w:t>
-      </w:r>
-      <w:r>
-        <w:rPr>
-          <w:rFonts w:ascii="Consolas" w:hAnsi="Consolas"/>
-          <w:sz w:val="19"/>
-        </w:rPr>
-        <w:t>GAZEBO_SETUP.md</w:t>
-      </w:r>
-      <w:r>
-        <w:t xml:space="preserve"> first.</w:t>
+        <w:t xml:space="preserve"> by hand, run the colcon build in section 4 first.</w:t>
       </w:r>
     </w:p>
     <w:p>
@@ -2711,7 +4382,7 @@
         <w:br/>
         <w:t>docker version | head -20</w:t>
         <w:br/>
-        <w:t>docker exec igvc_gazebo bash -c "source /opt/ros/jazzy/setup.bash &amp;&amp; bash src/IGVC_robot_2026/scripts/gazebo/render_check.sh" | tail -5</w:t>
+        <w:t>docker exec igvc_gazebo bash -c "bash src/IGVC_robot_2026/scripts/gazebo/render_check.sh" | tail -5</w:t>
         <w:br/>
         <w:t>docker exec igvc_gazebo ps -ef | grep -cE "gz sim|rviz2"</w:t>
       </w:r>
@@ -2733,20 +4404,7 @@
         <w:t>It does:</w:t>
       </w:r>
       <w:r>
-        <w:t xml:space="preserve"> run the real 2026 navigation stack - the ground-truth lane grid, the IGVC navigator, Nav2's controller, velocity smoother and collision monitor</w:t>
-      </w:r>
-    </w:p>
-    <w:p>
-      <w:pPr>
-        <w:pStyle w:val="ListBullet"/>
-      </w:pPr>
-      <w:r>
-        <w:t>against Gazebo, with none of those nodes modified. The robot drives the</w:t>
-      </w:r>
-    </w:p>
-    <w:p>
-      <w:r>
-        <w:t>course, stays between the lines and goes around the barrels.</w:t>
+        <w:t xml:space="preserve"> run the real 2026 navigation stack, that is the ground-truth lane grid, the IGVC navigator, Nav2's controller, velocity smoother and collision monitor, against Gazebo, with none of those nodes modified. The robot drives the course, stays between the lines and goes around the barrels.</w:t>
       </w:r>
     </w:p>
     <w:p>
@@ -2767,22 +4425,152 @@
         <w:t>IGVC_track_generator/track_points.json</w:t>
       </w:r>
       <w:r>
-        <w:t>, not out of the camera or the lidar. Both publish, and nothing plans on either. It is a *ground-truth* navigation test, and that is deliberate: when perception is added, a failure can be blamed on perception rather than on navigation.</w:t>
+        <w:t xml:space="preserve">, not out of the camera or the lidar. The camera, depth image, point cloud and lidar all publish, and </w:t>
+      </w:r>
+      <w:r>
+        <w:rPr>
+          <w:b/>
+        </w:rPr>
+        <w:t>nothing plans on any of them</w:t>
+      </w:r>
+      <w:r>
+        <w:t>. It is a *ground-truth* navigation test, and that is deliberate: when perception is added, a failure can be blamed on perception rather than on navigation.</w:t>
       </w:r>
     </w:p>
     <w:p>
       <w:r>
-        <w:t xml:space="preserve">Running the real lane detector here needs two things the image does not have yet: </w:t>
+        <w:t xml:space="preserve">More precisely, </w:t>
       </w:r>
       <w:r>
         <w:rPr>
           <w:rFonts w:ascii="Consolas" w:hAnsi="Consolas"/>
           <w:sz w:val="19"/>
         </w:rPr>
-        <w:t>torch</w:t>
-      </w:r>
-      <w:r>
-        <w:t xml:space="preserve"> and the YOLOPv2 weights.</w:t>
+        <w:t>gazebo_nav_test_nav2_overrides.yaml</w:t>
+      </w:r>
+      <w:r>
+        <w:t xml:space="preserve"> replaces the costmap </w:t>
+      </w:r>
+      <w:r>
+        <w:rPr>
+          <w:rFonts w:ascii="Consolas" w:hAnsi="Consolas"/>
+          <w:sz w:val="19"/>
+        </w:rPr>
+        <w:t>plugins</w:t>
+      </w:r>
+      <w:r>
+        <w:t xml:space="preserve"> list with </w:t>
+      </w:r>
+      <w:r>
+        <w:rPr>
+          <w:rFonts w:ascii="Consolas" w:hAnsi="Consolas"/>
+          <w:sz w:val="19"/>
+        </w:rPr>
+        <w:t>["lane_layer", "inflation_layer"]</w:t>
+      </w:r>
+      <w:r>
+        <w:t xml:space="preserve">, so Nav2's </w:t>
+      </w:r>
+      <w:r>
+        <w:rPr>
+          <w:rFonts w:ascii="Consolas" w:hAnsi="Consolas"/>
+          <w:sz w:val="19"/>
+        </w:rPr>
+        <w:t>obstacle_layer</w:t>
+      </w:r>
+      <w:r>
+        <w:t xml:space="preserve"> is never even instantiated. Every obstacle the robot has ever avoided in this simulator came from the JSON.</w:t>
+      </w:r>
+    </w:p>
+    <w:p>
+      <w:r>
+        <w:rPr>
+          <w:b/>
+        </w:rPr>
+        <w:t>The Hough lane detector does run</w:t>
+      </w:r>
+      <w:r>
+        <w:t xml:space="preserve">, and needs nothing extra: it is CLAHE, Canny and </w:t>
+      </w:r>
+      <w:r>
+        <w:rPr>
+          <w:rFonts w:ascii="Consolas" w:hAnsi="Consolas"/>
+          <w:sz w:val="19"/>
+        </w:rPr>
+        <w:t>HoughLinesP</w:t>
+      </w:r>
+      <w:r>
+        <w:t xml:space="preserve"> with no torch, and it produced 253 occupied cells in </w:t>
+      </w:r>
+      <w:r>
+        <w:rPr>
+          <w:rFonts w:ascii="Consolas" w:hAnsi="Consolas"/>
+          <w:sz w:val="19"/>
+        </w:rPr>
+        <w:t>/lane_map</w:t>
+      </w:r>
+      <w:r>
+        <w:t xml:space="preserve"> over a 90 s self-driven run. Nothing plans on its output. </w:t>
+      </w:r>
+      <w:r>
+        <w:rPr>
+          <w:b/>
+        </w:rPr>
+        <w:t>YOLOPv2 (`lane_segmentation_node`) does not run here</w:t>
+      </w:r>
+      <w:r>
+        <w:t>: it needs torch, which this image does not have, and weights that are not in the repo.</w:t>
+      </w:r>
+    </w:p>
+    <w:p>
+      <w:r>
+        <w:rPr>
+          <w:b/>
+        </w:rPr>
+        <w:t>The camera point cloud is rotated 90 degrees.</w:t>
+      </w:r>
+      <w:r>
+        <w:t xml:space="preserve"> Measured, not suspected: the cloud carries body-convention data stamped with the optical frame, so through its own frame the floor stands on its end. It is bridged, nothing consumes it, and </w:t>
+      </w:r>
+      <w:r>
+        <w:rPr>
+          <w:rFonts w:ascii="Consolas" w:hAnsi="Consolas"/>
+          <w:sz w:val="19"/>
+        </w:rPr>
+        <w:t>obstacle_layer</w:t>
+      </w:r>
+      <w:r>
+        <w:t xml:space="preserve"> is off, so it cannot currently do harm. </w:t>
+      </w:r>
+      <w:r>
+        <w:rPr>
+          <w:b/>
+        </w:rPr>
+        <w:t>It is not fixed</w:t>
+      </w:r>
+      <w:r>
+        <w:t xml:space="preserve">, deliberately, because fixing it means connecting a Nav2 consumer that has never been connected. See </w:t>
+      </w:r>
+      <w:r>
+        <w:rPr>
+          <w:rFonts w:ascii="Consolas" w:hAnsi="Consolas"/>
+          <w:sz w:val="19"/>
+        </w:rPr>
+        <w:t>GAZEBO_SETUP.md</w:t>
+      </w:r>
+      <w:r>
+        <w:t xml:space="preserve"> 10.6 and 10.10.</w:t>
+      </w:r>
+    </w:p>
+    <w:p>
+      <w:r>
+        <w:rPr>
+          <w:b/>
+        </w:rPr>
+        <w:t>`/fix` is not published.</w:t>
+      </w:r>
+      <w:r>
+        <w:t xml:space="preserve"> The GPS row of the interface contract is the one unbridged row. Nothing consumes it today.</w:t>
       </w:r>
     </w:p>
     <w:p>
@@ -2793,7 +4581,16 @@
         <w:t>It is not a ZED camera.</w:t>
       </w:r>
       <w:r>
-        <w:t xml:space="preserve"> The simulated cameras publish on the same topics with the same frame ids and the same intrinsics as the real ZED wrapper, so downstream code cannot tell the difference. The *content* is a plain pinhole camera with exact ray-cast depth. ZED neural depth, visual odometry and object detection have no Gazebo equivalent, and Stereolabs have said they are not planning to support Gazebo.</w:t>
+        <w:t xml:space="preserve"> The simulated cameras publish on the same topics with the same frame ids and the same intrinsics as the real ZED wrapper, so downstream code cannot tell the difference. The *content* is a plain pinhole camera with exact ray-cast depth. ZED neural depth, visual odometry and object detection have no Gazebo equivalent, and Stereolabs have said they are not planning to support Gazebo. The simulated field of view is 100 degrees and </w:t>
+      </w:r>
+      <w:r>
+        <w:rPr>
+          <w:b/>
+        </w:rPr>
+        <w:t>which lens is actually fitted to the robot is unknown</w:t>
+      </w:r>
+      <w:r>
+        <w:t>, so the sim is either 4.6 degrees too narrow or 26 degrees too wide and the sign is not known.</w:t>
       </w:r>
     </w:p>
     <w:p>
@@ -2805,6 +4602,17 @@
       </w:r>
       <w:r>
         <w:t xml:space="preserve"> Nav2's twist goes straight to Gazebo's built-in DiffDrive, which does the wheel kinematics itself. Joint limits and the controller update rate are therefore untested in simulation.</w:t>
+      </w:r>
+    </w:p>
+    <w:p>
+      <w:r>
+        <w:rPr>
+          <w:b/>
+        </w:rPr>
+        <w:t>Nothing here has been run on any machine but the one at the top of this file.</w:t>
+      </w:r>
+      <w:r>
+        <w:t xml:space="preserve"> Not the RTX 5080 laptop, not the Windows 10 machine, not native Linux.</w:t>
       </w:r>
     </w:p>
     <w:p/>
@@ -2829,7 +4637,10 @@
         </w:rPr>
         <w:t># all of these from a WSL2 shell, in the repo root</w:t>
         <w:br/>
-        <w:t>docker compose -f docker-compose.windows.yml build igvc_gazebo</w:t>
+        <w:t>bash scripts/gazebo/bootstrap.sh                                   # zero to verified</w:t>
+        <w:br/>
+        <w:t>IMAGE_TAR=/mnt/d/igvc-gazebo-jazzy.tar bash scripts/gazebo/bootstrap.sh   # from USB</w:t>
+        <w:br/>
         <w:br/>
         <w:t>docker compose -f docker-compose.windows.yml up -d igvc_gazebo</w:t>
         <w:br/>
@@ -2838,26 +4649,22 @@
         <w:t>docker compose -f docker-compose.windows.yml down                  # stop</w:t>
         <w:br/>
         <w:br/>
-        <w:t># inside the container</w:t>
+        <w:t>docker exec -it igvc_gazebo bash src/IGVC_robot_2026/scripts/gazebo/start_sim.sh                  # drive it yourself</w:t>
         <w:br/>
-        <w:t>docker exec -it igvc_gazebo bash src/IGVC_robot_2026/scripts/gazebo/start_sim.sh                    # drive it yourself</w:t>
+        <w:t>docker exec -it igvc_gazebo bash -c "NAV=1 bash src/IGVC_robot_2026/scripts/gazebo/start_sim.sh"  # it drives itself</w:t>
         <w:br/>
-        <w:t>docker exec -it igvc_gazebo bash -c "NAV=1 bash src/IGVC_robot_2026/scripts/gazebo/start_sim.sh"    # it drives itself</w:t>
-        <w:br/>
-        <w:t>docker exec -it igvc_gazebo bash          # a shell, for teleop</w:t>
+        <w:t>docker exec -it igvc_gazebo bash                                   # a shell, for teleop</w:t>
         <w:br/>
         <w:br/>
-        <w:t># checks, from a shell inside the container (docker exec -it igvc_gazebo bash).</w:t>
+        <w:t># the three checks. cwd inside the container is /root/ros2_ws;</w:t>
         <w:br/>
-        <w:t># cwd is /root/ros2_ws; the repo is one level down in src/IGVC_robot_2026.</w:t>
+        <w:t># the repo is one level down in src/IGVC_robot_2026.</w:t>
         <w:br/>
-        <w:t>source /opt/ros/jazzy/setup.bash</w:t>
+        <w:t>docker exec -it igvc_gazebo bash -c "bash src/IGVC_robot_2026/scripts/gazebo/render_check.sh"</w:t>
         <w:br/>
-        <w:t>bash src/IGVC_robot_2026/scripts/gazebo/render_check.sh          # GPU. run this first, on every machine</w:t>
+        <w:t>docker exec -it igvc_gazebo bash -c "bash src/IGVC_robot_2026/scripts/gazebo/bringup_smoke_test.sh"</w:t>
         <w:br/>
-        <w:t>bash src/IGVC_robot_2026/scripts/gazebo/bringup_smoke_test.sh    # simulator + topic contract</w:t>
-        <w:br/>
-        <w:t>bash src/IGVC_robot_2026/scripts/gazebo/autonomy_check.sh        # does it drive the course itself</w:t>
+        <w:t>docker exec -it igvc_gazebo bash -c "bash src/IGVC_robot_2026/scripts/gazebo/autonomy_check.sh"</w:t>
       </w:r>
     </w:p>
     <w:tbl>
@@ -2959,7 +4766,7 @@
           <w:p>
             <w:r/>
             <w:r>
-              <w:t>corrected odometry, world-aligned with its origin at the spawn point</w:t>
+              <w:t>corrected odometry, world-aligned, origin at the spawn point</w:t>
             </w:r>
           </w:p>
         </w:tc>

</xml_diff>